<commit_message>
Revise paragraph sequence, multi-sentence evidence and shared graded wordbook
</commit_message>
<xml_diff>
--- a/du/textbook/2hcl/unit1/ba-ai-shuo-chu-lai/downloads/teacher-guide.docx
+++ b/du/textbook/2hcl/unit1/ba-ai-shuo-chu-lai/downloads/teacher-guide.docx
@@ -256,7 +256,7 @@
                 <w:b w:val="0"/>
                 <w:sz w:val="20"/>
               </w:rPr>
-              <w:t>导入3分钟；第1–8段阅读15分钟；任务1–3共15分钟；第9–11段及任务4共12分钟；订正与词语5分钟。</w:t>
+              <w:t>导入3分钟；第1–8段逐段阅读与问题27分钟；第9–11段逐段阅读与问题15分钟；订正与词语5分钟。</w:t>
             </w:r>
           </w:p>
         </w:tc>
@@ -285,7 +285,7 @@
                 <w:b w:val="0"/>
                 <w:sz w:val="20"/>
               </w:rPr>
-              <w:t>课件1–17页。任务3简答；其余点选、取证和口头解释。</w:t>
+              <w:t>课件1–20页。第4段看法、第10段特点短答；其余点选、取证和口头解释。</w:t>
             </w:r>
           </w:p>
         </w:tc>
@@ -345,7 +345,7 @@
                 <w:b w:val="0"/>
                 <w:sz w:val="20"/>
               </w:rPr>
-              <w:t>复习3分钟；第12–15段阅读12分钟；任务5用8分钟；任务6用10分钟；任务7用12分钟；订正5分钟。</w:t>
+              <w:t>复习3分钟；第12段讨论及惯用语17分钟；第13–14段阅读、原因与词义17分钟；第15段细节作用8分钟；订正5分钟。</w:t>
             </w:r>
           </w:p>
         </w:tc>
@@ -374,7 +374,7 @@
                 <w:b w:val="0"/>
                 <w:sz w:val="20"/>
               </w:rPr>
-              <w:t>课件18–30页。任务5与7书面作答。</w:t>
+              <w:t>课件21–34页。第12段理由短记、第14段原因短答。</w:t>
             </w:r>
           </w:p>
         </w:tc>
@@ -434,7 +434,7 @@
                 <w:b w:val="0"/>
                 <w:sz w:val="20"/>
               </w:rPr>
-              <w:t>第16段及回读8分钟；任务8用12分钟；任务9讨论8分钟；任务10独立回应12分钟；自检订正与词语10分钟。</w:t>
+              <w:t>第16段阅读、回应与结尾15分钟；全文人物比较15分钟；开放回应12分钟；自检订正与词语8分钟。</w:t>
             </w:r>
           </w:p>
         </w:tc>
@@ -463,7 +463,7 @@
                 <w:b w:val="0"/>
                 <w:sz w:val="20"/>
               </w:rPr>
-              <w:t>课件31–45页。任务9简记与任务10完整回应。</w:t>
+              <w:t>课件35–50页。人物比较与开放回应独立写答。</w:t>
             </w:r>
           </w:p>
         </w:tc>
@@ -644,7 +644,7 @@
                 <w:b/>
                 <w:sz w:val="20"/>
               </w:rPr>
-              <w:t>任务</w:t>
+              <w:t>问题页</w:t>
             </w:r>
           </w:p>
         </w:tc>
@@ -762,7 +762,7 @@
                 <w:b w:val="0"/>
                 <w:sz w:val="20"/>
               </w:rPr>
-              <w:t>1、3、7、8、10</w:t>
+              <w:t>1</w:t>
             </w:r>
           </w:p>
         </w:tc>
@@ -880,7 +880,7 @@
                 <w:b w:val="0"/>
                 <w:sz w:val="20"/>
               </w:rPr>
-              <w:t>1、2、3、7、10</w:t>
+              <w:t>1</w:t>
             </w:r>
           </w:p>
         </w:tc>
@@ -998,7 +998,7 @@
                 <w:b w:val="0"/>
                 <w:sz w:val="20"/>
               </w:rPr>
-              <w:t>1、3、6、7、8、10</w:t>
+              <w:t>2</w:t>
             </w:r>
           </w:p>
         </w:tc>
@@ -1116,7 +1116,7 @@
                 <w:b w:val="0"/>
                 <w:sz w:val="20"/>
               </w:rPr>
-              <w:t>1、2、3、7、10</w:t>
+              <w:t>3</w:t>
             </w:r>
           </w:p>
         </w:tc>
@@ -1234,7 +1234,6 @@
                 <w:b w:val="0"/>
                 <w:sz w:val="20"/>
               </w:rPr>
-              <w:t>3、10</w:t>
             </w:r>
           </w:p>
         </w:tc>
@@ -1352,7 +1351,6 @@
                 <w:b w:val="0"/>
                 <w:sz w:val="20"/>
               </w:rPr>
-              <w:t>3、7、10</w:t>
             </w:r>
           </w:p>
         </w:tc>
@@ -1470,7 +1468,6 @@
                 <w:b w:val="0"/>
                 <w:sz w:val="20"/>
               </w:rPr>
-              <w:t>3、7、10</w:t>
             </w:r>
           </w:p>
         </w:tc>
@@ -1588,7 +1585,7 @@
                 <w:b w:val="0"/>
                 <w:sz w:val="20"/>
               </w:rPr>
-              <w:t>3、8、10</w:t>
+              <w:t>4</w:t>
             </w:r>
           </w:p>
         </w:tc>
@@ -1706,7 +1703,7 @@
                 <w:b w:val="0"/>
                 <w:sz w:val="20"/>
               </w:rPr>
-              <w:t>4、8、10</w:t>
+              <w:t>5</w:t>
             </w:r>
           </w:p>
         </w:tc>
@@ -1824,7 +1821,7 @@
                 <w:b w:val="0"/>
                 <w:sz w:val="20"/>
               </w:rPr>
-              <w:t>4、5、7、10</w:t>
+              <w:t>6</w:t>
             </w:r>
           </w:p>
         </w:tc>
@@ -1942,7 +1939,7 @@
                 <w:b w:val="0"/>
                 <w:sz w:val="20"/>
               </w:rPr>
-              <w:t>4、5、7、9、10</w:t>
+              <w:t>7</w:t>
             </w:r>
           </w:p>
         </w:tc>
@@ -2060,7 +2057,7 @@
                 <w:b w:val="0"/>
                 <w:sz w:val="20"/>
               </w:rPr>
-              <w:t>2、5、7、9、10</w:t>
+              <w:t>8、9</w:t>
             </w:r>
           </w:p>
         </w:tc>
@@ -2178,7 +2175,6 @@
                 <w:b w:val="0"/>
                 <w:sz w:val="20"/>
               </w:rPr>
-              <w:t>5、7、9、10</w:t>
             </w:r>
           </w:p>
         </w:tc>
@@ -2296,7 +2292,7 @@
                 <w:b w:val="0"/>
                 <w:sz w:val="20"/>
               </w:rPr>
-              <w:t>5、6、7、9、10</w:t>
+              <w:t>10、11</w:t>
             </w:r>
           </w:p>
         </w:tc>
@@ -2414,7 +2410,7 @@
                 <w:b w:val="0"/>
                 <w:sz w:val="20"/>
               </w:rPr>
-              <w:t>5、6、7、9、10</w:t>
+              <w:t>12</w:t>
             </w:r>
           </w:p>
         </w:tc>
@@ -2532,7 +2528,7 @@
                 <w:b w:val="0"/>
                 <w:sz w:val="20"/>
               </w:rPr>
-              <w:t>8、10</w:t>
+              <w:t>13</w:t>
             </w:r>
           </w:p>
         </w:tc>
@@ -2688,7 +2684,7 @@
         <w:snapToGrid w:val="0"/>
       </w:pPr>
       <w:r>
-        <w:t>任务1　同一件事，不同反应</w:t>
+        <w:t>问题页1　同一件事，不同反应</w:t>
       </w:r>
     </w:p>
     <w:p>
@@ -2881,7 +2877,7 @@
         <w:rPr>
           <w:b w:val="0"/>
         </w:rPr>
-        <w:t>第一次：Compare their responses to the article（念文章）.</w:t>
+        <w:t>第一次：比较两人听文章时的反应。</w:t>
       </w:r>
     </w:p>
     <w:p>
@@ -2892,7 +2888,7 @@
         <w:rPr>
           <w:b w:val="0"/>
         </w:rPr>
-        <w:t>第二次：Look at paragraphs 1–2: 再三赞叹、再看一遍、逃走.</w:t>
+        <w:t>第二次：看第1、2段：再三赞叹、再看一遍、逃走。</w:t>
       </w:r>
     </w:p>
     <w:p>
@@ -2903,7 +2899,7 @@
         <w:rPr>
           <w:b w:val="0"/>
         </w:rPr>
-        <w:t>讲评：Direct Info: paragraphs 1–2. No extra inference is needed（直接比较）.</w:t>
+        <w:t>讲评：直接信息（Direct Info）：比较第1、2段写明的表现，无须额外推断。</w:t>
       </w:r>
     </w:p>
     <w:p>
@@ -2913,7 +2909,7 @@
         <w:snapToGrid w:val="0"/>
       </w:pPr>
       <w:r>
-        <w:t>任务2　惯用语在语境中</w:t>
+        <w:t>问题页2　第三段：张大眼睛</w:t>
       </w:r>
     </w:p>
     <w:p>
@@ -2924,7 +2920,1289 @@
         <w:rPr>
           <w:b/>
         </w:rPr>
-        <w:t>第1课　你做　来源：课本 阅读放大镜一</w:t>
+        <w:t>第1课　口头讨论　来源：教参 第3段</w:t>
+      </w:r>
+    </w:p>
+    <w:p>
+      <w:pPr>
+        <w:snapToGrid w:val="0"/>
+      </w:pPr>
+      <w:r>
+        <w:rPr>
+          <w:rFonts w:ascii="LXGW WenKai TC" w:hAnsi="LXGW WenKai TC" w:eastAsia="LXGW WenKai TC"/>
+          <w:b w:val="0"/>
+        </w:rPr>
+        <w:t>可以删掉“张大眼睛”吗？为什么？</w:t>
+      </w:r>
+    </w:p>
+    <w:p>
+      <w:pPr>
+        <w:pStyle w:val="Heading2"/>
+        <w:snapToGrid w:val="0"/>
+      </w:pPr>
+      <w:r>
+        <w:t>审题与取证</w:t>
+      </w:r>
+    </w:p>
+    <w:p>
+      <w:pPr>
+        <w:snapToGrid w:val="0"/>
+      </w:pPr>
+      <w:r>
+        <w:rPr>
+          <w:b w:val="0"/>
+        </w:rPr>
+        <w:t>题干关键词：为什么、删掉。</w:t>
+      </w:r>
+    </w:p>
+    <w:p>
+      <w:pPr>
+        <w:snapToGrid w:val="0"/>
+      </w:pPr>
+      <w:r>
+        <w:rPr>
+          <w:b w:val="0"/>
+        </w:rPr>
+        <w:t>定位范围：第3段。</w:t>
+      </w:r>
+    </w:p>
+    <w:p>
+      <w:pPr>
+        <w:snapToGrid w:val="0"/>
+      </w:pPr>
+      <w:r>
+        <w:rPr>
+          <w:b w:val="0"/>
+        </w:rPr>
+        <w:t>所需加工：先就本段口头回答，再展开讲评，不计自动分。</w:t>
+      </w:r>
+    </w:p>
+    <w:p>
+      <w:pPr>
+        <w:pStyle w:val="Heading2"/>
+        <w:snapToGrid w:val="0"/>
+      </w:pPr>
+      <w:r>
+        <w:t>参考答案</w:t>
+      </w:r>
+    </w:p>
+    <w:p>
+      <w:pPr>
+        <w:snapToGrid w:val="0"/>
+      </w:pPr>
+      <w:r>
+        <w:rPr>
+          <w:rFonts w:ascii="LXGW WenKai TC" w:hAnsi="LXGW WenKai TC" w:eastAsia="LXGW WenKai TC"/>
+          <w:b w:val="0"/>
+        </w:rPr>
+        <w:t>不宜删掉。这个神态细节表现女儿看见新衣时的惊喜和欣赏，和真诚的赞美互相配合。</w:t>
+      </w:r>
+    </w:p>
+    <w:p>
+      <w:pPr>
+        <w:pStyle w:val="Heading2"/>
+        <w:snapToGrid w:val="0"/>
+      </w:pPr>
+      <w:r>
+        <w:t>意义得分点与接受范围</w:t>
+      </w:r>
+    </w:p>
+    <w:p>
+      <w:pPr>
+        <w:snapToGrid w:val="0"/>
+      </w:pPr>
+      <w:r>
+        <w:rPr>
+          <w:b w:val="0"/>
+        </w:rPr>
+        <w:t>不接受或需订正：只说“生动形象”而没有说明具体内容。</w:t>
+      </w:r>
+    </w:p>
+    <w:p>
+      <w:pPr>
+        <w:pStyle w:val="Heading2"/>
+        <w:snapToGrid w:val="0"/>
+      </w:pPr>
+      <w:r>
+        <w:t>分层提示与讲评</w:t>
+      </w:r>
+    </w:p>
+    <w:p>
+      <w:pPr>
+        <w:snapToGrid w:val="0"/>
+      </w:pPr>
+      <w:r>
+        <w:rPr>
+          <w:b w:val="0"/>
+        </w:rPr>
+        <w:t>第一次：结合本段内容，说出具体作用。</w:t>
+      </w:r>
+    </w:p>
+    <w:p>
+      <w:pPr>
+        <w:snapToGrid w:val="0"/>
+      </w:pPr>
+      <w:r>
+        <w:rPr>
+          <w:b w:val="0"/>
+        </w:rPr>
+        <w:t>第二次：说明这处文字写出了什么。</w:t>
+      </w:r>
+    </w:p>
+    <w:p>
+      <w:pPr>
+        <w:snapToGrid w:val="0"/>
+      </w:pPr>
+      <w:r>
+        <w:rPr>
+          <w:b w:val="0"/>
+        </w:rPr>
+        <w:t>讲评：不宜删掉。这个神态细节表现女儿看见新衣时的惊喜和欣赏，和真诚的赞美互相配合。</w:t>
+      </w:r>
+    </w:p>
+    <w:p>
+      <w:pPr>
+        <w:pStyle w:val="Heading1"/>
+        <w:pageBreakBefore/>
+        <w:snapToGrid w:val="0"/>
+      </w:pPr>
+      <w:r>
+        <w:t>问题页3　第四段：儿子爱“我”吗</w:t>
+      </w:r>
+    </w:p>
+    <w:p>
+      <w:pPr>
+        <w:snapToGrid w:val="0"/>
+      </w:pPr>
+      <w:r>
+        <w:rPr>
+          <w:b/>
+        </w:rPr>
+        <w:t>第1课　你做　来源：课本旁注 第4段</w:t>
+      </w:r>
+    </w:p>
+    <w:p>
+      <w:pPr>
+        <w:snapToGrid w:val="0"/>
+      </w:pPr>
+      <w:r>
+        <w:rPr>
+          <w:rFonts w:ascii="LXGW WenKai TC" w:hAnsi="LXGW WenKai TC" w:eastAsia="LXGW WenKai TC"/>
+          <w:b w:val="0"/>
+        </w:rPr>
+        <w:t>你觉得儿子爱“我”吗？为什么？</w:t>
+      </w:r>
+    </w:p>
+    <w:p>
+      <w:pPr>
+        <w:pStyle w:val="Heading2"/>
+        <w:snapToGrid w:val="0"/>
+      </w:pPr>
+      <w:r>
+        <w:t>审题与取证</w:t>
+      </w:r>
+    </w:p>
+    <w:p>
+      <w:pPr>
+        <w:snapToGrid w:val="0"/>
+      </w:pPr>
+      <w:r>
+        <w:rPr>
+          <w:b w:val="0"/>
+        </w:rPr>
+        <w:t>题干关键词：你觉得、为什么。</w:t>
+      </w:r>
+    </w:p>
+    <w:p>
+      <w:pPr>
+        <w:snapToGrid w:val="0"/>
+      </w:pPr>
+      <w:r>
+        <w:rPr>
+          <w:b w:val="0"/>
+        </w:rPr>
+        <w:t>定位范围：第2、4段。</w:t>
+      </w:r>
+    </w:p>
+    <w:p>
+      <w:pPr>
+        <w:snapToGrid w:val="0"/>
+      </w:pPr>
+      <w:r>
+        <w:rPr>
+          <w:b w:val="0"/>
+        </w:rPr>
+        <w:t>所需加工：筛选证据，概括意义并解释关系，组织独立书面答案。</w:t>
+      </w:r>
+    </w:p>
+    <w:p>
+      <w:pPr>
+        <w:pStyle w:val="Heading2"/>
+        <w:snapToGrid w:val="0"/>
+      </w:pPr>
+      <w:r>
+        <w:t>参考答案</w:t>
+      </w:r>
+    </w:p>
+    <w:p>
+      <w:pPr>
+        <w:snapToGrid w:val="0"/>
+      </w:pPr>
+      <w:r>
+        <w:rPr>
+          <w:rFonts w:ascii="LXGW WenKai TC" w:hAnsi="LXGW WenKai TC" w:eastAsia="LXGW WenKai TC"/>
+          <w:b w:val="0"/>
+        </w:rPr>
+        <w:t>我认为儿子可能也爱妈妈，只是不习惯赞美或说出感情。不过，课文没有足够证据确定他的内心，不能只凭拒绝听文章、说妹妹拍马屁，就断定他不爱妈妈。</w:t>
+      </w:r>
+    </w:p>
+    <w:p>
+      <w:pPr>
+        <w:pStyle w:val="Heading2"/>
+        <w:snapToGrid w:val="0"/>
+      </w:pPr>
+      <w:r>
+        <w:t>意义得分点与接受范围</w:t>
+      </w:r>
+    </w:p>
+    <w:p>
+      <w:pPr>
+        <w:snapToGrid w:val="0"/>
+      </w:pPr>
+      <w:r>
+        <w:rPr>
+          <w:b w:val="0"/>
+        </w:rPr>
+        <w:t>• 说清看法，并承认证据的限度（建议1分）</w:t>
+      </w:r>
+    </w:p>
+    <w:p>
+      <w:pPr>
+        <w:snapToGrid w:val="0"/>
+      </w:pPr>
+      <w:r>
+        <w:rPr>
+          <w:b w:val="0"/>
+        </w:rPr>
+        <w:t>• 依据儿子的实际表现解释（建议1分）</w:t>
+      </w:r>
+    </w:p>
+    <w:p>
+      <w:pPr>
+        <w:snapToGrid w:val="0"/>
+      </w:pPr>
+      <w:r>
+        <w:rPr>
+          <w:b w:val="0"/>
+        </w:rPr>
+        <w:t>以上分值为课堂讲评建议，并非教材公布的官方评分。按独立意义单位给分，接受等义表达。引用原文可作证据，但须筛选并回应题意；整段照抄不等于完成分析。</w:t>
+      </w:r>
+    </w:p>
+    <w:p>
+      <w:pPr>
+        <w:snapToGrid w:val="0"/>
+      </w:pPr>
+      <w:r>
+        <w:rPr>
+          <w:b w:val="0"/>
+        </w:rPr>
+        <w:t>不接受或需订正：拒绝“儿子一定不爱妈妈”或“所有孩子天生都爱妈妈”的无依据断言。</w:t>
+      </w:r>
+    </w:p>
+    <w:p>
+      <w:pPr>
+        <w:pStyle w:val="Heading2"/>
+        <w:snapToGrid w:val="0"/>
+      </w:pPr>
+      <w:r>
+        <w:t>分层提示与讲评</w:t>
+      </w:r>
+    </w:p>
+    <w:p>
+      <w:pPr>
+        <w:snapToGrid w:val="0"/>
+      </w:pPr>
+      <w:r>
+        <w:rPr>
+          <w:b w:val="0"/>
+        </w:rPr>
+        <w:t>第一次：没有说赞美的话，就一定没有爱吗？</w:t>
+      </w:r>
+    </w:p>
+    <w:p>
+      <w:pPr>
+        <w:snapToGrid w:val="0"/>
+      </w:pPr>
+      <w:r>
+        <w:rPr>
+          <w:b w:val="0"/>
+        </w:rPr>
+        <w:t>第二次：第2、4段写出他的表现，但没有直接说明他的内心。</w:t>
+      </w:r>
+    </w:p>
+    <w:p>
+      <w:pPr>
+        <w:snapToGrid w:val="0"/>
+      </w:pPr>
+      <w:r>
+        <w:rPr>
+          <w:b w:val="0"/>
+        </w:rPr>
+        <w:t>讲评：儿子的语言和行动是明示事实；内心感情需要推断（Inference），不能说得过于肯定。</w:t>
+      </w:r>
+    </w:p>
+    <w:p>
+      <w:pPr>
+        <w:snapToGrid w:val="0"/>
+      </w:pPr>
+      <w:r>
+        <w:rPr>
+          <w:b w:val="0"/>
+        </w:rPr>
+        <w:t>先保留首次回答，比较得分意义后在订正框补足。网页不按字数或关键词给主观题评分；教师覆核观点、证据及关系。</w:t>
+      </w:r>
+    </w:p>
+    <w:p>
+      <w:pPr>
+        <w:pStyle w:val="Heading1"/>
+        <w:pageBreakBefore/>
+        <w:snapToGrid w:val="0"/>
+      </w:pPr>
+      <w:r>
+        <w:t>问题页4　第八段：“我”的感受</w:t>
+      </w:r>
+    </w:p>
+    <w:p>
+      <w:pPr>
+        <w:snapToGrid w:val="0"/>
+      </w:pPr>
+      <w:r>
+        <w:rPr>
+          <w:b/>
+        </w:rPr>
+        <w:t>第1课　你做　来源：课本旁注 第8段</w:t>
+      </w:r>
+    </w:p>
+    <w:p>
+      <w:pPr>
+        <w:snapToGrid w:val="0"/>
+      </w:pPr>
+      <w:r>
+        <w:rPr>
+          <w:rFonts w:ascii="LXGW WenKai TC" w:hAnsi="LXGW WenKai TC" w:eastAsia="LXGW WenKai TC"/>
+          <w:b w:val="0"/>
+        </w:rPr>
+        <w:t>结合上文女儿和儿子的表现，说说“我”的感受。</w:t>
+      </w:r>
+    </w:p>
+    <w:p>
+      <w:pPr>
+        <w:pStyle w:val="Heading2"/>
+        <w:snapToGrid w:val="0"/>
+      </w:pPr>
+      <w:r>
+        <w:t>审题与取证</w:t>
+      </w:r>
+    </w:p>
+    <w:p>
+      <w:pPr>
+        <w:snapToGrid w:val="0"/>
+      </w:pPr>
+      <w:r>
+        <w:rPr>
+          <w:b w:val="0"/>
+        </w:rPr>
+        <w:t>题干关键词：结合上文、感受。</w:t>
+      </w:r>
+    </w:p>
+    <w:p>
+      <w:pPr>
+        <w:snapToGrid w:val="0"/>
+      </w:pPr>
+      <w:r>
+        <w:rPr>
+          <w:b w:val="0"/>
+        </w:rPr>
+        <w:t>定位范围：第1、3、5、6、7、8段。</w:t>
+      </w:r>
+    </w:p>
+    <w:p>
+      <w:pPr>
+        <w:snapToGrid w:val="0"/>
+      </w:pPr>
+      <w:r>
+        <w:rPr>
+          <w:b w:val="0"/>
+        </w:rPr>
+        <w:t>所需加工：定位并比较、辨析或整合信息；检查后说明为什么。</w:t>
+      </w:r>
+    </w:p>
+    <w:p>
+      <w:pPr>
+        <w:pStyle w:val="Heading2"/>
+        <w:snapToGrid w:val="0"/>
+      </w:pPr>
+      <w:r>
+        <w:t>参考答案</w:t>
+      </w:r>
+    </w:p>
+    <w:p>
+      <w:pPr>
+        <w:snapToGrid w:val="0"/>
+      </w:pPr>
+      <w:r>
+        <w:rPr>
+          <w:rFonts w:ascii="LXGW WenKai TC" w:hAnsi="LXGW WenKai TC" w:eastAsia="LXGW WenKai TC"/>
+          <w:b w:val="0"/>
+        </w:rPr>
+        <w:t>女儿的赞美让“我”有成就感、心情愉快；看到女儿的卡片，又觉得再辛苦也是值得的。</w:t>
+      </w:r>
+    </w:p>
+    <w:p>
+      <w:pPr>
+        <w:pStyle w:val="Heading2"/>
+        <w:snapToGrid w:val="0"/>
+      </w:pPr>
+      <w:r>
+        <w:t>意义得分点与接受范围</w:t>
+      </w:r>
+    </w:p>
+    <w:p>
+      <w:pPr>
+        <w:snapToGrid w:val="0"/>
+      </w:pPr>
+      <w:r>
+        <w:rPr>
+          <w:b w:val="0"/>
+        </w:rPr>
+        <w:t>• 整合成就感、愉快和辛苦值得（建议2分）</w:t>
+      </w:r>
+    </w:p>
+    <w:p>
+      <w:pPr>
+        <w:snapToGrid w:val="0"/>
+      </w:pPr>
+      <w:r>
+        <w:rPr>
+          <w:b w:val="0"/>
+        </w:rPr>
+        <w:t>以上分值为课堂讲评建议，并非教材公布的官方评分。按独立意义单位给分，接受等义表达。引用原文可作证据，但须筛选并回应题意；整段照抄不等于完成分析。</w:t>
+      </w:r>
+    </w:p>
+    <w:p>
+      <w:pPr>
+        <w:snapToGrid w:val="0"/>
+      </w:pPr>
+      <w:r>
+        <w:rPr>
+          <w:b w:val="0"/>
+        </w:rPr>
+        <w:t>不接受或需订正：只写“开心”不够具体；也不能把女儿带来的温暖归因于儿子的拒绝或否定。</w:t>
+      </w:r>
+    </w:p>
+    <w:p>
+      <w:pPr>
+        <w:pStyle w:val="Heading2"/>
+        <w:snapToGrid w:val="0"/>
+      </w:pPr>
+      <w:r>
+        <w:t>分层提示与讲评</w:t>
+      </w:r>
+    </w:p>
+    <w:p>
+      <w:pPr>
+        <w:snapToGrid w:val="0"/>
+      </w:pPr>
+      <w:r>
+        <w:rPr>
+          <w:b w:val="0"/>
+        </w:rPr>
+        <w:t>第一次：留意课文直接写出的感受。</w:t>
+      </w:r>
+    </w:p>
+    <w:p>
+      <w:pPr>
+        <w:snapToGrid w:val="0"/>
+      </w:pPr>
+      <w:r>
+        <w:rPr>
+          <w:b w:val="0"/>
+        </w:rPr>
+        <w:t>第二次：回看第1、3、8段。</w:t>
+      </w:r>
+    </w:p>
+    <w:p>
+      <w:pPr>
+        <w:snapToGrid w:val="0"/>
+      </w:pPr>
+      <w:r>
+        <w:rPr>
+          <w:b w:val="0"/>
+        </w:rPr>
+        <w:t>讲评：第1段写成就感，第3段写愉快，第8段写辛苦值得。</w:t>
+      </w:r>
+    </w:p>
+    <w:p>
+      <w:pPr>
+        <w:pStyle w:val="Heading1"/>
+        <w:pageBreakBefore/>
+        <w:snapToGrid w:val="0"/>
+      </w:pPr>
+      <w:r>
+        <w:t>问题页5　第九段：母亲的情况</w:t>
+      </w:r>
+    </w:p>
+    <w:p>
+      <w:pPr>
+        <w:snapToGrid w:val="0"/>
+      </w:pPr>
+      <w:r>
+        <w:rPr>
+          <w:b/>
+        </w:rPr>
+        <w:t>第1课　口头讨论　来源：教参 第9段</w:t>
+      </w:r>
+    </w:p>
+    <w:p>
+      <w:pPr>
+        <w:snapToGrid w:val="0"/>
+      </w:pPr>
+      <w:r>
+        <w:rPr>
+          <w:rFonts w:ascii="LXGW WenKai TC" w:hAnsi="LXGW WenKai TC" w:eastAsia="LXGW WenKai TC"/>
+          <w:b w:val="0"/>
+        </w:rPr>
+        <w:t>为什么作者要在第9段写父亲过世后母亲的情况？</w:t>
+      </w:r>
+    </w:p>
+    <w:p>
+      <w:pPr>
+        <w:pStyle w:val="Heading2"/>
+        <w:snapToGrid w:val="0"/>
+      </w:pPr>
+      <w:r>
+        <w:t>审题与取证</w:t>
+      </w:r>
+    </w:p>
+    <w:p>
+      <w:pPr>
+        <w:snapToGrid w:val="0"/>
+      </w:pPr>
+      <w:r>
+        <w:rPr>
+          <w:b w:val="0"/>
+        </w:rPr>
+        <w:t>题干关键词：为什么、删掉。</w:t>
+      </w:r>
+    </w:p>
+    <w:p>
+      <w:pPr>
+        <w:snapToGrid w:val="0"/>
+      </w:pPr>
+      <w:r>
+        <w:rPr>
+          <w:b w:val="0"/>
+        </w:rPr>
+        <w:t>定位范围：第9段。</w:t>
+      </w:r>
+    </w:p>
+    <w:p>
+      <w:pPr>
+        <w:snapToGrid w:val="0"/>
+      </w:pPr>
+      <w:r>
+        <w:rPr>
+          <w:b w:val="0"/>
+        </w:rPr>
+        <w:t>所需加工：先就本段口头回答，再展开讲评，不计自动分。</w:t>
+      </w:r>
+    </w:p>
+    <w:p>
+      <w:pPr>
+        <w:pStyle w:val="Heading2"/>
+        <w:snapToGrid w:val="0"/>
+      </w:pPr>
+      <w:r>
+        <w:t>参考答案</w:t>
+      </w:r>
+    </w:p>
+    <w:p>
+      <w:pPr>
+        <w:snapToGrid w:val="0"/>
+      </w:pPr>
+      <w:r>
+        <w:rPr>
+          <w:rFonts w:ascii="LXGW WenKai TC" w:hAnsi="LXGW WenKai TC" w:eastAsia="LXGW WenKai TC"/>
+          <w:b w:val="0"/>
+        </w:rPr>
+        <w:t>交代母亲寂寞、沉默的背景及为家务付出的爱，使“我”的感激有依据，也与结尾歌声形成对照。</w:t>
+      </w:r>
+    </w:p>
+    <w:p>
+      <w:pPr>
+        <w:pStyle w:val="Heading2"/>
+        <w:snapToGrid w:val="0"/>
+      </w:pPr>
+      <w:r>
+        <w:t>意义得分点与接受范围</w:t>
+      </w:r>
+    </w:p>
+    <w:p>
+      <w:pPr>
+        <w:snapToGrid w:val="0"/>
+      </w:pPr>
+      <w:r>
+        <w:rPr>
+          <w:b w:val="0"/>
+        </w:rPr>
+        <w:t>不接受或需订正：只说“生动形象”而没有说明具体内容。</w:t>
+      </w:r>
+    </w:p>
+    <w:p>
+      <w:pPr>
+        <w:pStyle w:val="Heading2"/>
+        <w:snapToGrid w:val="0"/>
+      </w:pPr>
+      <w:r>
+        <w:t>分层提示与讲评</w:t>
+      </w:r>
+    </w:p>
+    <w:p>
+      <w:pPr>
+        <w:snapToGrid w:val="0"/>
+      </w:pPr>
+      <w:r>
+        <w:rPr>
+          <w:b w:val="0"/>
+        </w:rPr>
+        <w:t>第一次：结合本段内容，说出具体作用。</w:t>
+      </w:r>
+    </w:p>
+    <w:p>
+      <w:pPr>
+        <w:snapToGrid w:val="0"/>
+      </w:pPr>
+      <w:r>
+        <w:rPr>
+          <w:b w:val="0"/>
+        </w:rPr>
+        <w:t>第二次：说明这处文字写出了什么。</w:t>
+      </w:r>
+    </w:p>
+    <w:p>
+      <w:pPr>
+        <w:snapToGrid w:val="0"/>
+      </w:pPr>
+      <w:r>
+        <w:rPr>
+          <w:b w:val="0"/>
+        </w:rPr>
+        <w:t>讲评：交代母亲丧偶、沉默的背景及为家务付出的爱，使“我”的感激有依据。读到第16段后，再联系结尾歌声作对照。</w:t>
+      </w:r>
+    </w:p>
+    <w:p>
+      <w:pPr>
+        <w:pStyle w:val="Heading1"/>
+        <w:pageBreakBefore/>
+        <w:snapToGrid w:val="0"/>
+      </w:pPr>
+      <w:r>
+        <w:t>问题页6　第十段：感激与反思</w:t>
+      </w:r>
+    </w:p>
+    <w:p>
+      <w:pPr>
+        <w:snapToGrid w:val="0"/>
+      </w:pPr>
+      <w:r>
+        <w:rPr>
+          <w:b/>
+        </w:rPr>
+        <w:t>第1课　我们做　来源：课本旁注 第10段</w:t>
+      </w:r>
+    </w:p>
+    <w:p>
+      <w:pPr>
+        <w:snapToGrid w:val="0"/>
+      </w:pPr>
+      <w:r>
+        <w:rPr>
+          <w:rFonts w:ascii="LXGW WenKai TC" w:hAnsi="LXGW WenKai TC" w:eastAsia="LXGW WenKai TC"/>
+          <w:b w:val="0"/>
+        </w:rPr>
+        <w:t>第10段主要运用了哪一种人物描写？表现了“我”怎样的特点？</w:t>
+      </w:r>
+    </w:p>
+    <w:p>
+      <w:pPr>
+        <w:pStyle w:val="Heading2"/>
+        <w:snapToGrid w:val="0"/>
+      </w:pPr>
+      <w:r>
+        <w:t>审题与取证</w:t>
+      </w:r>
+    </w:p>
+    <w:p>
+      <w:pPr>
+        <w:snapToGrid w:val="0"/>
+      </w:pPr>
+      <w:r>
+        <w:rPr>
+          <w:b w:val="0"/>
+        </w:rPr>
+        <w:t>题干关键词：主要、人物描写、特点。</w:t>
+      </w:r>
+    </w:p>
+    <w:p>
+      <w:pPr>
+        <w:snapToGrid w:val="0"/>
+      </w:pPr>
+      <w:r>
+        <w:rPr>
+          <w:b w:val="0"/>
+        </w:rPr>
+        <w:t>“我”反思自己的原句（可加入多句）：第10段；注意“扪心自问”“是不是应该”“我不是常常”。</w:t>
+      </w:r>
+    </w:p>
+    <w:p>
+      <w:pPr>
+        <w:snapToGrid w:val="0"/>
+      </w:pPr>
+      <w:r>
+        <w:rPr>
+          <w:b w:val="0"/>
+        </w:rPr>
+        <w:t>所需加工：筛选证据，概括意义并解释关系，组织独立书面答案。</w:t>
+      </w:r>
+    </w:p>
+    <w:p>
+      <w:pPr>
+        <w:pStyle w:val="Heading2"/>
+        <w:snapToGrid w:val="0"/>
+      </w:pPr>
+      <w:r>
+        <w:t>参考答案</w:t>
+      </w:r>
+    </w:p>
+    <w:p>
+      <w:pPr>
+        <w:snapToGrid w:val="0"/>
+      </w:pPr>
+      <w:r>
+        <w:rPr>
+          <w:rFonts w:ascii="LXGW WenKai TC" w:hAnsi="LXGW WenKai TC" w:eastAsia="LXGW WenKai TC"/>
+          <w:b w:val="0"/>
+        </w:rPr>
+        <w:t>主要是心理描写。写出“我”感激母亲的付出，也反省自己从未表达感谢，想向女儿学习。这可支持“懂得感恩、善于反思”的特点。</w:t>
+      </w:r>
+    </w:p>
+    <w:p>
+      <w:pPr>
+        <w:pStyle w:val="Heading2"/>
+        <w:snapToGrid w:val="0"/>
+      </w:pPr>
+      <w:r>
+        <w:t>意义得分点与接受范围</w:t>
+      </w:r>
+    </w:p>
+    <w:p>
+      <w:pPr>
+        <w:snapToGrid w:val="0"/>
+      </w:pPr>
+      <w:r>
+        <w:rPr>
+          <w:b w:val="0"/>
+        </w:rPr>
+        <w:t>• 准确判断心理描写（建议1分）</w:t>
+      </w:r>
+    </w:p>
+    <w:p>
+      <w:pPr>
+        <w:snapToGrid w:val="0"/>
+      </w:pPr>
+      <w:r>
+        <w:rPr>
+          <w:b w:val="0"/>
+        </w:rPr>
+        <w:t>• 找出连续两个反思问句（建议1分）</w:t>
+      </w:r>
+    </w:p>
+    <w:p>
+      <w:pPr>
+        <w:snapToGrid w:val="0"/>
+      </w:pPr>
+      <w:r>
+        <w:rPr>
+          <w:b w:val="0"/>
+        </w:rPr>
+        <w:t>• 自己概括特点并联系原句说明（建议2分）</w:t>
+      </w:r>
+    </w:p>
+    <w:p>
+      <w:pPr>
+        <w:snapToGrid w:val="0"/>
+      </w:pPr>
+      <w:r>
+        <w:rPr>
+          <w:b w:val="0"/>
+        </w:rPr>
+        <w:t>以上分值为课堂讲评建议，并非教材公布的官方评分。按独立意义单位给分，接受等义表达。引用原文可作证据，但须筛选并回应题意；整段照抄不等于完成分析。</w:t>
+      </w:r>
+    </w:p>
+    <w:p>
+      <w:pPr>
+        <w:snapToGrid w:val="0"/>
+      </w:pPr>
+      <w:r>
+        <w:rPr>
+          <w:b w:val="0"/>
+        </w:rPr>
+        <w:t>不接受或需订正：“一边开车”是真实行动，但不能把整段主体判为行动描写。</w:t>
+      </w:r>
+    </w:p>
+    <w:p>
+      <w:pPr>
+        <w:pStyle w:val="Heading2"/>
+        <w:snapToGrid w:val="0"/>
+      </w:pPr>
+      <w:r>
+        <w:t>分层提示与讲评</w:t>
+      </w:r>
+    </w:p>
+    <w:p>
+      <w:pPr>
+        <w:snapToGrid w:val="0"/>
+      </w:pPr>
+      <w:r>
+        <w:rPr>
+          <w:b w:val="0"/>
+        </w:rPr>
+        <w:t>第一次：这些话是说出口的，还是心里想的？</w:t>
+      </w:r>
+    </w:p>
+    <w:p>
+      <w:pPr>
+        <w:snapToGrid w:val="0"/>
+      </w:pPr>
+      <w:r>
+        <w:rPr>
+          <w:b w:val="0"/>
+        </w:rPr>
+        <w:t>第二次：留意“一边想”“扪心自问”和后面连续两个问句。</w:t>
+      </w:r>
+    </w:p>
+    <w:p>
+      <w:pPr>
+        <w:snapToGrid w:val="0"/>
+      </w:pPr>
+      <w:r>
+        <w:rPr>
+          <w:b w:val="0"/>
+        </w:rPr>
+        <w:t>讲评：心理描写（psychological description）写出感激和反思。人物特点须联系原句解释。</w:t>
+      </w:r>
+    </w:p>
+    <w:p>
+      <w:pPr>
+        <w:snapToGrid w:val="0"/>
+      </w:pPr>
+      <w:r>
+        <w:rPr>
+          <w:b w:val="0"/>
+        </w:rPr>
+        <w:t>先保留首次回答，比较得分意义后在订正框补足。网页不按字数或关键词给主观题评分；教师覆核观点、证据及关系。</w:t>
+      </w:r>
+    </w:p>
+    <w:p>
+      <w:pPr>
+        <w:pStyle w:val="Heading1"/>
+        <w:pageBreakBefore/>
+        <w:snapToGrid w:val="0"/>
+      </w:pPr>
+      <w:r>
+        <w:t>问题页7　第十一段：下定决心</w:t>
+      </w:r>
+    </w:p>
+    <w:p>
+      <w:pPr>
+        <w:snapToGrid w:val="0"/>
+      </w:pPr>
+      <w:r>
+        <w:rPr>
+          <w:b/>
+        </w:rPr>
+        <w:t>第1课　口头讨论　来源：教参 第11段</w:t>
+      </w:r>
+    </w:p>
+    <w:p>
+      <w:pPr>
+        <w:snapToGrid w:val="0"/>
+      </w:pPr>
+      <w:r>
+        <w:rPr>
+          <w:rFonts w:ascii="LXGW WenKai TC" w:hAnsi="LXGW WenKai TC" w:eastAsia="LXGW WenKai TC"/>
+          <w:b w:val="0"/>
+        </w:rPr>
+        <w:t>第11段可不可以删掉？为什么？</w:t>
+      </w:r>
+    </w:p>
+    <w:p>
+      <w:pPr>
+        <w:pStyle w:val="Heading2"/>
+        <w:snapToGrid w:val="0"/>
+      </w:pPr>
+      <w:r>
+        <w:t>审题与取证</w:t>
+      </w:r>
+    </w:p>
+    <w:p>
+      <w:pPr>
+        <w:snapToGrid w:val="0"/>
+      </w:pPr>
+      <w:r>
+        <w:rPr>
+          <w:b w:val="0"/>
+        </w:rPr>
+        <w:t>题干关键词：为什么、删掉。</w:t>
+      </w:r>
+    </w:p>
+    <w:p>
+      <w:pPr>
+        <w:snapToGrid w:val="0"/>
+      </w:pPr>
+      <w:r>
+        <w:rPr>
+          <w:b w:val="0"/>
+        </w:rPr>
+        <w:t>定位范围：第11段。</w:t>
+      </w:r>
+    </w:p>
+    <w:p>
+      <w:pPr>
+        <w:snapToGrid w:val="0"/>
+      </w:pPr>
+      <w:r>
+        <w:rPr>
+          <w:b w:val="0"/>
+        </w:rPr>
+        <w:t>所需加工：先就本段口头回答，再展开讲评，不计自动分。</w:t>
+      </w:r>
+    </w:p>
+    <w:p>
+      <w:pPr>
+        <w:pStyle w:val="Heading2"/>
+        <w:snapToGrid w:val="0"/>
+      </w:pPr>
+      <w:r>
+        <w:t>参考答案</w:t>
+      </w:r>
+    </w:p>
+    <w:p>
+      <w:pPr>
+        <w:snapToGrid w:val="0"/>
+      </w:pPr>
+      <w:r>
+        <w:rPr>
+          <w:rFonts w:ascii="LXGW WenKai TC" w:hAnsi="LXGW WenKai TC" w:eastAsia="LXGW WenKai TC"/>
+          <w:b w:val="0"/>
+        </w:rPr>
+        <w:t>不宜删掉。它写“我”下决心并给自己打气，接续第10段的反思，引出后面的尝试和退缩，使心理变化完整。</w:t>
+      </w:r>
+    </w:p>
+    <w:p>
+      <w:pPr>
+        <w:pStyle w:val="Heading2"/>
+        <w:snapToGrid w:val="0"/>
+      </w:pPr>
+      <w:r>
+        <w:t>意义得分点与接受范围</w:t>
+      </w:r>
+    </w:p>
+    <w:p>
+      <w:pPr>
+        <w:snapToGrid w:val="0"/>
+      </w:pPr>
+      <w:r>
+        <w:rPr>
+          <w:b w:val="0"/>
+        </w:rPr>
+        <w:t>不接受或需订正：只说“生动形象”而没有说明具体内容。</w:t>
+      </w:r>
+    </w:p>
+    <w:p>
+      <w:pPr>
+        <w:pStyle w:val="Heading2"/>
+        <w:snapToGrid w:val="0"/>
+      </w:pPr>
+      <w:r>
+        <w:t>分层提示与讲评</w:t>
+      </w:r>
+    </w:p>
+    <w:p>
+      <w:pPr>
+        <w:snapToGrid w:val="0"/>
+      </w:pPr>
+      <w:r>
+        <w:rPr>
+          <w:b w:val="0"/>
+        </w:rPr>
+        <w:t>第一次：结合本段内容，说出具体作用。</w:t>
+      </w:r>
+    </w:p>
+    <w:p>
+      <w:pPr>
+        <w:snapToGrid w:val="0"/>
+      </w:pPr>
+      <w:r>
+        <w:rPr>
+          <w:b w:val="0"/>
+        </w:rPr>
+        <w:t>第二次：说明这处文字写出了什么。</w:t>
+      </w:r>
+    </w:p>
+    <w:p>
+      <w:pPr>
+        <w:snapToGrid w:val="0"/>
+      </w:pPr>
+      <w:r>
+        <w:rPr>
+          <w:b w:val="0"/>
+        </w:rPr>
+        <w:t>讲评：不宜删掉。它写“我”下决心并给自己打气，接续第10段的反思，引出后面的尝试和退缩，使心理变化完整。</w:t>
+      </w:r>
+    </w:p>
+    <w:p>
+      <w:pPr>
+        <w:pStyle w:val="Heading1"/>
+        <w:pageBreakBefore/>
+        <w:snapToGrid w:val="0"/>
+      </w:pPr>
+      <w:r>
+        <w:t>问题页8　第十二段：第一次一定最难吗</w:t>
+      </w:r>
+    </w:p>
+    <w:p>
+      <w:pPr>
+        <w:snapToGrid w:val="0"/>
+      </w:pPr>
+      <w:r>
+        <w:rPr>
+          <w:b/>
+        </w:rPr>
+        <w:t>第2课　我们做　来源：课本旁注 第12段</w:t>
+      </w:r>
+    </w:p>
+    <w:p>
+      <w:pPr>
+        <w:snapToGrid w:val="0"/>
+      </w:pPr>
+      <w:r>
+        <w:rPr>
+          <w:rFonts w:ascii="LXGW WenKai TC" w:hAnsi="LXGW WenKai TC" w:eastAsia="LXGW WenKai TC"/>
+          <w:b w:val="0"/>
+        </w:rPr>
+        <w:t>“我”认为第一次对母亲说出爱总是最难的。你同意吗？为什么？</w:t>
+      </w:r>
+    </w:p>
+    <w:p>
+      <w:pPr>
+        <w:pStyle w:val="Heading2"/>
+        <w:snapToGrid w:val="0"/>
+      </w:pPr>
+      <w:r>
+        <w:t>审题与取证</w:t>
+      </w:r>
+    </w:p>
+    <w:p>
+      <w:pPr>
+        <w:snapToGrid w:val="0"/>
+      </w:pPr>
+      <w:r>
+        <w:rPr>
+          <w:b w:val="0"/>
+        </w:rPr>
+        <w:t>题干关键词：你同意吗、为什么。</w:t>
+      </w:r>
+    </w:p>
+    <w:p>
+      <w:pPr>
+        <w:snapToGrid w:val="0"/>
+      </w:pPr>
+      <w:r>
+        <w:rPr>
+          <w:b w:val="0"/>
+        </w:rPr>
+        <w:t>定位范围：第12段。</w:t>
+      </w:r>
+    </w:p>
+    <w:p>
+      <w:pPr>
+        <w:snapToGrid w:val="0"/>
+      </w:pPr>
+      <w:r>
+        <w:rPr>
+          <w:b w:val="0"/>
+        </w:rPr>
+        <w:t>所需加工：明确立场，解释适用条件，用课文支持判断。</w:t>
+      </w:r>
+    </w:p>
+    <w:p>
+      <w:pPr>
+        <w:pStyle w:val="Heading2"/>
+        <w:snapToGrid w:val="0"/>
+      </w:pPr>
+      <w:r>
+        <w:t>参考答案</w:t>
+      </w:r>
+    </w:p>
+    <w:p>
+      <w:pPr>
+        <w:snapToGrid w:val="0"/>
+      </w:pPr>
+      <w:r>
+        <w:rPr>
+          <w:rFonts w:ascii="LXGW WenKai TC" w:hAnsi="LXGW WenKai TC" w:eastAsia="LXGW WenKai TC"/>
+          <w:b w:val="0"/>
+        </w:rPr>
+        <w:t>可以部分同意。对一向把感情藏在心里的人，第一次开口要克服害羞和不习惯，像文中的“我”；但对平时就常表达感情的人，例如女儿，开口可能较自然。因此，难不难与个人习惯和关系情境有关。</w:t>
+      </w:r>
+    </w:p>
+    <w:p>
+      <w:pPr>
+        <w:pStyle w:val="Heading2"/>
+        <w:snapToGrid w:val="0"/>
+      </w:pPr>
+      <w:r>
+        <w:t>意义得分点与接受范围</w:t>
+      </w:r>
+    </w:p>
+    <w:p>
+      <w:pPr>
+        <w:snapToGrid w:val="0"/>
+      </w:pPr>
+      <w:r>
+        <w:rPr>
+          <w:b w:val="0"/>
+        </w:rPr>
+        <w:t>• 表明立场（建议1分）</w:t>
+      </w:r>
+    </w:p>
+    <w:p>
+      <w:pPr>
+        <w:snapToGrid w:val="0"/>
+      </w:pPr>
+      <w:r>
+        <w:rPr>
+          <w:b w:val="0"/>
+        </w:rPr>
+        <w:t>• 解释适用的人或条件（建议1分）</w:t>
+      </w:r>
+    </w:p>
+    <w:p>
+      <w:pPr>
+        <w:snapToGrid w:val="0"/>
+      </w:pPr>
+      <w:r>
+        <w:rPr>
+          <w:b w:val="0"/>
+        </w:rPr>
+        <w:t>• 用课文例子支持理由（建议1分）</w:t>
+      </w:r>
+    </w:p>
+    <w:p>
+      <w:pPr>
+        <w:snapToGrid w:val="0"/>
+      </w:pPr>
+      <w:r>
+        <w:rPr>
+          <w:b w:val="0"/>
+        </w:rPr>
+        <w:t>以上分值为课堂讲评建议，并非教材公布的官方评分。按独立意义单位给分，接受等义表达。引用原文可作证据，但须筛选并回应题意；整段照抄不等于完成分析。</w:t>
+      </w:r>
+    </w:p>
+    <w:p>
+      <w:pPr>
+        <w:snapToGrid w:val="0"/>
+      </w:pPr>
+      <w:r>
+        <w:rPr>
+          <w:b w:val="0"/>
+        </w:rPr>
+        <w:t>不接受或需订正：只写“同意，因为第一次最难”是循环解释。</w:t>
+      </w:r>
+    </w:p>
+    <w:p>
+      <w:pPr>
+        <w:pStyle w:val="Heading2"/>
+        <w:snapToGrid w:val="0"/>
+      </w:pPr>
+      <w:r>
+        <w:t>分层提示与讲评</w:t>
+      </w:r>
+    </w:p>
+    <w:p>
+      <w:pPr>
+        <w:snapToGrid w:val="0"/>
+      </w:pPr>
+      <w:r>
+        <w:rPr>
+          <w:b w:val="0"/>
+        </w:rPr>
+        <w:t>第一次：难不难与个人习惯有什么关系？</w:t>
+      </w:r>
+    </w:p>
+    <w:p>
+      <w:pPr>
+        <w:snapToGrid w:val="0"/>
+      </w:pPr>
+      <w:r>
+        <w:rPr>
+          <w:b w:val="0"/>
+        </w:rPr>
+        <w:t>第二次：可以比较“我”和女儿平时表达感情的习惯。</w:t>
+      </w:r>
+    </w:p>
+    <w:p>
+      <w:pPr>
+        <w:snapToGrid w:val="0"/>
+      </w:pPr>
+      <w:r>
+        <w:rPr>
+          <w:b w:val="0"/>
+        </w:rPr>
+        <w:t>讲评：有根据的不同看法都可以接受。要说明适用的人或情境。</w:t>
+      </w:r>
+    </w:p>
+    <w:p>
+      <w:pPr>
+        <w:snapToGrid w:val="0"/>
+      </w:pPr>
+      <w:r>
+        <w:rPr>
+          <w:b w:val="0"/>
+        </w:rPr>
+        <w:t>先保留首次回答，比较得分意义后在订正框补足。网页不按字数或关键词给主观题评分；教师覆核观点、证据及关系。</w:t>
+      </w:r>
+    </w:p>
+    <w:p>
+      <w:pPr>
+        <w:pStyle w:val="Heading1"/>
+        <w:pageBreakBefore/>
+        <w:snapToGrid w:val="0"/>
+      </w:pPr>
+      <w:r>
+        <w:t>问题页9　惯用语在语境中</w:t>
+      </w:r>
+    </w:p>
+    <w:p>
+      <w:pPr>
+        <w:snapToGrid w:val="0"/>
+      </w:pPr>
+      <w:r>
+        <w:rPr>
+          <w:b/>
+        </w:rPr>
+        <w:t>第2课　你做　来源：课本 阅读放大镜一</w:t>
       </w:r>
     </w:p>
     <w:p>
@@ -3119,7 +4397,7 @@
         <w:rPr>
           <w:b w:val="0"/>
         </w:rPr>
-        <w:t>第一次：Ask what happened: rejection, discouragement or withdrawal?</w:t>
+        <w:t>第一次：想想是被拒绝、被打击热情，还是自己退缩。</w:t>
       </w:r>
     </w:p>
     <w:p>
@@ -3141,7 +4419,7 @@
         <w:rPr>
           <w:b w:val="0"/>
         </w:rPr>
-        <w:t>讲评：Use the figurative meaning（比喻义）. Here, 泼冷水 does not mean pouring real water.</w:t>
+        <w:t>讲评：惯用语要按语境理解比喻义（figurative meaning），不能只看字面。</w:t>
       </w:r>
     </w:p>
     <w:p>
@@ -3151,7 +4429,7 @@
         <w:snapToGrid w:val="0"/>
       </w:pPr>
       <w:r>
-        <w:t>任务3　没说出口，能说明什么？</w:t>
+        <w:t>问题页10　第十四段：破天荒</w:t>
       </w:r>
     </w:p>
     <w:p>
@@ -3162,7 +4440,7 @@
         <w:rPr>
           <w:b/>
         </w:rPr>
-        <w:t>第1课　你做　来源：课本旁注 第4、8段</w:t>
+        <w:t>第2课　我们做　来源：教参补充 第14段</w:t>
       </w:r>
     </w:p>
     <w:p>
@@ -3174,7 +4452,58 @@
           <w:rFonts w:ascii="LXGW WenKai TC" w:hAnsi="LXGW WenKai TC" w:eastAsia="LXGW WenKai TC"/>
           <w:b w:val="0"/>
         </w:rPr>
-        <w:t>你觉得儿子爱“我”吗？为什么？</w:t>
+        <w:t>“破天荒”是什么意思？在文中有什么含义？</w:t>
+      </w:r>
+    </w:p>
+    <w:p>
+      <w:pPr>
+        <w:pStyle w:val="Heading2"/>
+        <w:snapToGrid w:val="0"/>
+      </w:pPr>
+      <w:r>
+        <w:t>审题与取证</w:t>
+      </w:r>
+    </w:p>
+    <w:p>
+      <w:pPr>
+        <w:snapToGrid w:val="0"/>
+      </w:pPr>
+      <w:r>
+        <w:rPr>
+          <w:b w:val="0"/>
+        </w:rPr>
+        <w:t>题干关键词：什么意思、文中、含义。</w:t>
+      </w:r>
+    </w:p>
+    <w:p>
+      <w:pPr>
+        <w:snapToGrid w:val="0"/>
+      </w:pPr>
+      <w:r>
+        <w:rPr>
+          <w:b w:val="0"/>
+        </w:rPr>
+        <w:t>定位范围：第14段。</w:t>
+      </w:r>
+    </w:p>
+    <w:p>
+      <w:pPr>
+        <w:snapToGrid w:val="0"/>
+      </w:pPr>
+      <w:r>
+        <w:rPr>
+          <w:b w:val="0"/>
+        </w:rPr>
+        <w:t>所需加工：定位并比较、辨析或整合信息；检查后说明为什么。</w:t>
+      </w:r>
+    </w:p>
+    <w:p>
+      <w:pPr>
+        <w:pStyle w:val="Heading2"/>
+        <w:snapToGrid w:val="0"/>
+      </w:pPr>
+      <w:r>
+        <w:t>参考答案</w:t>
       </w:r>
     </w:p>
     <w:p>
@@ -3186,7 +4515,7 @@
           <w:rFonts w:ascii="LXGW WenKai TC" w:hAnsi="LXGW WenKai TC" w:eastAsia="LXGW WenKai TC"/>
           <w:b w:val="0"/>
         </w:rPr>
-        <w:t>结合上文女儿和儿子的表现，说说“我”的感受。</w:t>
+        <w:t>指以前从未有过。这里指“我”第一次直接向母亲说出感谢和爱。</w:t>
       </w:r>
     </w:p>
     <w:p>
@@ -3195,7 +4524,7 @@
         <w:snapToGrid w:val="0"/>
       </w:pPr>
       <w:r>
-        <w:t>审题与取证</w:t>
+        <w:t>意义得分点与接受范围</w:t>
       </w:r>
     </w:p>
     <w:p>
@@ -3206,7 +4535,7 @@
         <w:rPr>
           <w:b w:val="0"/>
         </w:rPr>
-        <w:t>题干关键词：你觉得、为什么、感受。</w:t>
+        <w:t>• 指出以前从未有过（建议1分）</w:t>
       </w:r>
     </w:p>
     <w:p>
@@ -3217,81 +4546,7 @@
         <w:rPr>
           <w:b w:val="0"/>
         </w:rPr>
-        <w:t>定位范围：第1至8段。</w:t>
-      </w:r>
-    </w:p>
-    <w:p>
-      <w:pPr>
-        <w:snapToGrid w:val="0"/>
-      </w:pPr>
-      <w:r>
-        <w:rPr>
-          <w:b w:val="0"/>
-        </w:rPr>
-        <w:t>所需加工：筛选证据，概括意义并解释关系，组织独立书面答案。</w:t>
-      </w:r>
-    </w:p>
-    <w:p>
-      <w:pPr>
-        <w:pStyle w:val="Heading2"/>
-        <w:snapToGrid w:val="0"/>
-      </w:pPr>
-      <w:r>
-        <w:t>参考答案</w:t>
-      </w:r>
-    </w:p>
-    <w:p>
-      <w:pPr>
-        <w:snapToGrid w:val="0"/>
-      </w:pPr>
-      <w:r>
-        <w:rPr>
-          <w:rFonts w:ascii="LXGW WenKai TC" w:hAnsi="LXGW WenKai TC" w:eastAsia="LXGW WenKai TC"/>
-          <w:b w:val="0"/>
-        </w:rPr>
-        <w:t>我认为儿子可能也爱妈妈，只是不习惯赞美或说出感情。不过，课文没有足够证据确定他的内心，不能只凭拒绝听文章、说妹妹拍马屁，就断定他不爱妈妈。相比儿子的表现，女儿的赞美让“我”有成就感、心情愉快，卡片让“我”感到温暖，觉得再辛苦也值得。</w:t>
-      </w:r>
-    </w:p>
-    <w:p>
-      <w:pPr>
-        <w:pStyle w:val="Heading2"/>
-        <w:snapToGrid w:val="0"/>
-      </w:pPr>
-      <w:r>
-        <w:t>意义得分点与接受范围</w:t>
-      </w:r>
-    </w:p>
-    <w:p>
-      <w:pPr>
-        <w:snapToGrid w:val="0"/>
-      </w:pPr>
-      <w:r>
-        <w:rPr>
-          <w:b w:val="0"/>
-        </w:rPr>
-        <w:t>• 说清看法，并承认证据的限度（建议1分）</w:t>
-      </w:r>
-    </w:p>
-    <w:p>
-      <w:pPr>
-        <w:snapToGrid w:val="0"/>
-      </w:pPr>
-      <w:r>
-        <w:rPr>
-          <w:b w:val="0"/>
-        </w:rPr>
-        <w:t>• 依据儿子的实际表现解释（建议1分）</w:t>
-      </w:r>
-    </w:p>
-    <w:p>
-      <w:pPr>
-        <w:snapToGrid w:val="0"/>
-      </w:pPr>
-      <w:r>
-        <w:rPr>
-          <w:b w:val="0"/>
-        </w:rPr>
-        <w:t>• 整合“我”的成就感、愉快和辛劳值得（建议2分）</w:t>
+        <w:t>• 联系首次向母亲直接表达感谢和爱（建议1分）</w:t>
       </w:r>
     </w:p>
     <w:p>
@@ -3313,7 +4568,7 @@
         <w:rPr>
           <w:b w:val="0"/>
         </w:rPr>
-        <w:t>不接受或需订正：拒绝“儿子一定不爱妈妈”或“所有孩子天生都爱妈妈”的无依据断言。</w:t>
+        <w:t>不接受或需订正：只解释“第一次”而不说明第一次做什么，不完整；不能说“我”以前不爱母亲。</w:t>
       </w:r>
     </w:p>
     <w:p>
@@ -3333,7 +4588,7 @@
         <w:rPr>
           <w:b w:val="0"/>
         </w:rPr>
-        <w:t>第一次：Does refusing praise prove a lack of love?（不赞美＝不爱？）</w:t>
+        <w:t>第一次：“第一次”指什么事情？</w:t>
       </w:r>
     </w:p>
     <w:p>
@@ -3344,7 +4599,7 @@
         <w:rPr>
           <w:b w:val="0"/>
         </w:rPr>
-        <w:t>第二次：Paragraph 4 shows his words. Paragraphs 1, 3 and 8 show her feelings.</w:t>
+        <w:t>第二次：注意“说道”后面的内容。</w:t>
       </w:r>
     </w:p>
     <w:p>
@@ -3355,18 +4610,7 @@
         <w:rPr>
           <w:b w:val="0"/>
         </w:rPr>
-        <w:t>讲评：The son’s words are facts in the story. His inner feelings require inference（内心需推断）. Different supported views may be accepted.</w:t>
-      </w:r>
-    </w:p>
-    <w:p>
-      <w:pPr>
-        <w:snapToGrid w:val="0"/>
-      </w:pPr>
-      <w:r>
-        <w:rPr>
-          <w:b w:val="0"/>
-        </w:rPr>
-        <w:t>先保留首次回答，比较得分意义后在订正框补足。网页不按字数或关键词给主观题评分；教师覆核观点、证据及关系。</w:t>
+        <w:t>讲评：词义加上语境，才是完整解释。</w:t>
       </w:r>
     </w:p>
     <w:p>
@@ -3376,251 +4620,7 @@
         <w:snapToGrid w:val="0"/>
       </w:pPr>
       <w:r>
-        <w:t>任务4　感激如何变成决定</w:t>
-      </w:r>
-    </w:p>
-    <w:p>
-      <w:pPr>
-        <w:snapToGrid w:val="0"/>
-      </w:pPr>
-      <w:r>
-        <w:rPr>
-          <w:b/>
-        </w:rPr>
-        <w:t>第1课　我们做　来源：课本旁注 第10段；教参补充 第9、11段</w:t>
-      </w:r>
-    </w:p>
-    <w:p>
-      <w:pPr>
-        <w:snapToGrid w:val="0"/>
-      </w:pPr>
-      <w:r>
-        <w:rPr>
-          <w:rFonts w:ascii="LXGW WenKai TC" w:hAnsi="LXGW WenKai TC" w:eastAsia="LXGW WenKai TC"/>
-          <w:b w:val="0"/>
-        </w:rPr>
-        <w:t>第10段主要运用了哪一种人物描写？表现了“我”怎样的特点？</w:t>
-      </w:r>
-    </w:p>
-    <w:p>
-      <w:pPr>
-        <w:pStyle w:val="Heading2"/>
-        <w:snapToGrid w:val="0"/>
-      </w:pPr>
-      <w:r>
-        <w:t>审题与取证</w:t>
-      </w:r>
-    </w:p>
-    <w:p>
-      <w:pPr>
-        <w:snapToGrid w:val="0"/>
-      </w:pPr>
-      <w:r>
-        <w:rPr>
-          <w:b w:val="0"/>
-        </w:rPr>
-        <w:t>题干关键词：主要、人物描写、特点。</w:t>
-      </w:r>
-    </w:p>
-    <w:p>
-      <w:pPr>
-        <w:snapToGrid w:val="0"/>
-      </w:pPr>
-      <w:r>
-        <w:rPr>
-          <w:b w:val="0"/>
-        </w:rPr>
-        <w:t>“我”反思自己的原句：第10段；注意“扪心自问”“是不是应该”“我不是常常”。</w:t>
-      </w:r>
-    </w:p>
-    <w:p>
-      <w:pPr>
-        <w:snapToGrid w:val="0"/>
-      </w:pPr>
-      <w:r>
-        <w:rPr>
-          <w:b w:val="0"/>
-        </w:rPr>
-        <w:t>所需加工：定位并比较、辨析或整合信息；检查后说明为什么。</w:t>
-      </w:r>
-    </w:p>
-    <w:p>
-      <w:pPr>
-        <w:pStyle w:val="Heading2"/>
-        <w:snapToGrid w:val="0"/>
-      </w:pPr>
-      <w:r>
-        <w:t>参考答案</w:t>
-      </w:r>
-    </w:p>
-    <w:p>
-      <w:pPr>
-        <w:snapToGrid w:val="0"/>
-      </w:pPr>
-      <w:r>
-        <w:rPr>
-          <w:rFonts w:ascii="LXGW WenKai TC" w:hAnsi="LXGW WenKai TC" w:eastAsia="LXGW WenKai TC"/>
-          <w:b w:val="0"/>
-        </w:rPr>
-        <w:t>主要是心理描写。写出“我”感激母亲的付出，也反省自己从未表达感谢，想向女儿学习。这可支持“懂得感恩、善于反思”的特点；人物完整分析在任务7自主作答。</w:t>
-      </w:r>
-    </w:p>
-    <w:p>
-      <w:pPr>
-        <w:pStyle w:val="Heading2"/>
-        <w:snapToGrid w:val="0"/>
-      </w:pPr>
-      <w:r>
-        <w:t>意义得分点与接受范围</w:t>
-      </w:r>
-    </w:p>
-    <w:p>
-      <w:pPr>
-        <w:snapToGrid w:val="0"/>
-      </w:pPr>
-      <w:r>
-        <w:rPr>
-          <w:b w:val="0"/>
-        </w:rPr>
-        <w:t>• 准确判断心理描写（建议1分）</w:t>
-      </w:r>
-    </w:p>
-    <w:p>
-      <w:pPr>
-        <w:snapToGrid w:val="0"/>
-      </w:pPr>
-      <w:r>
-        <w:rPr>
-          <w:b w:val="0"/>
-        </w:rPr>
-        <w:t>• 用内心独白解释感激和自我反思（建议2分）</w:t>
-      </w:r>
-    </w:p>
-    <w:p>
-      <w:pPr>
-        <w:snapToGrid w:val="0"/>
-      </w:pPr>
-      <w:r>
-        <w:rPr>
-          <w:b w:val="0"/>
-        </w:rPr>
-        <w:t>以上分值为课堂讲评建议，并非教材公布的官方评分。按独立意义单位给分，接受等义表达。引用原文可作证据，但须筛选并回应题意；整段照抄不等于完成分析。</w:t>
-      </w:r>
-    </w:p>
-    <w:p>
-      <w:pPr>
-        <w:snapToGrid w:val="0"/>
-      </w:pPr>
-      <w:r>
-        <w:rPr>
-          <w:b w:val="0"/>
-        </w:rPr>
-        <w:t>不接受或需订正：“一边开车”是真实行动，但不能把整段主体判为行动描写。</w:t>
-      </w:r>
-    </w:p>
-    <w:p>
-      <w:pPr>
-        <w:pStyle w:val="Heading2"/>
-        <w:snapToGrid w:val="0"/>
-      </w:pPr>
-      <w:r>
-        <w:t>分层提示与讲评</w:t>
-      </w:r>
-    </w:p>
-    <w:p>
-      <w:pPr>
-        <w:snapToGrid w:val="0"/>
-      </w:pPr>
-      <w:r>
-        <w:rPr>
-          <w:b w:val="0"/>
-        </w:rPr>
-        <w:t>第一次：What is spoken aloud? What happens only in her mind?</w:t>
-      </w:r>
-    </w:p>
-    <w:p>
-      <w:pPr>
-        <w:snapToGrid w:val="0"/>
-      </w:pPr>
-      <w:r>
-        <w:rPr>
-          <w:b w:val="0"/>
-        </w:rPr>
-        <w:t>第二次：第10段“一边想”“扪心自问”；第11段“下定决心”。</w:t>
-      </w:r>
-    </w:p>
-    <w:p>
-      <w:pPr>
-        <w:snapToGrid w:val="0"/>
-      </w:pPr>
-      <w:r>
-        <w:rPr>
-          <w:b w:val="0"/>
-        </w:rPr>
-        <w:t>讲评：Thoughts reveal both gratitude and reflection（感恩、反思）. Naming a technique alone is incomplete.</w:t>
-      </w:r>
-    </w:p>
-    <w:p>
-      <w:pPr>
-        <w:pStyle w:val="Heading2"/>
-        <w:snapToGrid w:val="0"/>
-      </w:pPr>
-      <w:r>
-        <w:t>保留的教参口头追问</w:t>
-      </w:r>
-    </w:p>
-    <w:p>
-      <w:pPr>
-        <w:snapToGrid w:val="0"/>
-      </w:pPr>
-      <w:r>
-        <w:rPr>
-          <w:b/>
-        </w:rPr>
-        <w:t>为什么作者要在第9段写父亲过世后母亲的情况？</w:t>
-      </w:r>
-    </w:p>
-    <w:p>
-      <w:pPr>
-        <w:snapToGrid w:val="0"/>
-      </w:pPr>
-      <w:r>
-        <w:rPr>
-          <w:b w:val="0"/>
-        </w:rPr>
-        <w:t>交代母亲寂寞、沉默的背景及为家务付出的爱，使“我”的感激有依据，也与结尾歌声形成对照。</w:t>
-      </w:r>
-    </w:p>
-    <w:p>
-      <w:pPr>
-        <w:snapToGrid w:val="0"/>
-      </w:pPr>
-      <w:r>
-        <w:rPr>
-          <w:b/>
-        </w:rPr>
-        <w:t>第11段可不可以删掉？为什么？</w:t>
-      </w:r>
-    </w:p>
-    <w:p>
-      <w:pPr>
-        <w:snapToGrid w:val="0"/>
-      </w:pPr>
-      <w:r>
-        <w:rPr>
-          <w:b w:val="0"/>
-        </w:rPr>
-        <w:t>不宜删掉。它写“我”下决心并给自己打气，接续第10段的反思，引出后面的尝试和退缩，使心理变化完整。</w:t>
-      </w:r>
-    </w:p>
-    <w:p>
-      <w:pPr>
-        <w:pStyle w:val="Heading1"/>
-        <w:pageBreakBefore/>
-        <w:snapToGrid w:val="0"/>
-      </w:pPr>
-      <w:r>
-        <w:t>任务5　为什么迟迟说不出口</w:t>
+        <w:t>问题页11　为什么迟迟说不出口</w:t>
       </w:r>
     </w:p>
     <w:p>
@@ -3685,7 +4685,7 @@
         <w:rPr>
           <w:b w:val="0"/>
         </w:rPr>
-        <w:t>面对母亲时的表现：第12、13、14、15段；注意“害羞”“疙瘩”“低着头”“不敢”。</w:t>
+        <w:t>面对母亲时的表现：第12、13、14段；注意“害羞”“疙瘩”“低着头”“不敢”。</w:t>
       </w:r>
     </w:p>
     <w:p>
@@ -3801,7 +4801,7 @@
         <w:rPr>
           <w:b w:val="0"/>
         </w:rPr>
-        <w:t>第一次：Explain the barrier（障碍）, not the lunch events.</w:t>
+        <w:t>第一次：说明表达上的困难，不必复述吃饭经过。</w:t>
       </w:r>
     </w:p>
     <w:p>
@@ -3812,7 +4812,7 @@
         <w:rPr>
           <w:b w:val="0"/>
         </w:rPr>
-        <w:t>第二次：第10段“从未”；第12段“害羞”；第14段“第一次”。</w:t>
+        <w:t>第二次：第10段“从未”，第12段“害羞”，第14段“第一次”。</w:t>
       </w:r>
     </w:p>
     <w:p>
@@ -3823,7 +4823,7 @@
         <w:rPr>
           <w:b w:val="0"/>
         </w:rPr>
-        <w:t>讲评：The text supports unfamiliarity and embarrassment（不习惯、害羞）. Personality or cultural influence is only a possible explanation, not a stated fact.</w:t>
+        <w:t>讲评：原文支持“不习惯表达”和“害羞”。不能把特定文化背景当成已确定的原因。</w:t>
       </w:r>
     </w:p>
     <w:p>
@@ -3844,7 +4844,7 @@
         <w:snapToGrid w:val="0"/>
       </w:pPr>
       <w:r>
-        <w:t>任务6　细节怎样突出心情</w:t>
+        <w:t>问题页12　第十五段：比考试还紧张</w:t>
       </w:r>
     </w:p>
     <w:p>
@@ -3855,7 +4855,7 @@
         <w:rPr>
           <w:b/>
         </w:rPr>
-        <w:t>第2课　我们做　来源：课本旁注 第15段；教参补充 第3、14段</w:t>
+        <w:t>第2课　我们做　来源：课本旁注 第15段</w:t>
       </w:r>
     </w:p>
     <w:p>
@@ -3898,7 +4898,7 @@
         <w:rPr>
           <w:b w:val="0"/>
         </w:rPr>
-        <w:t>定位范围：第3、14、15段。</w:t>
+        <w:t>定位范围：第15段。</w:t>
       </w:r>
     </w:p>
     <w:p>
@@ -4003,7 +5003,7 @@
         <w:rPr>
           <w:b w:val="0"/>
         </w:rPr>
-        <w:t>第一次：The comparison is about degree（程度）.</w:t>
+        <w:t>第一次：比较突出的是紧张的程度。</w:t>
       </w:r>
     </w:p>
     <w:p>
@@ -4014,7 +5014,7 @@
         <w:rPr>
           <w:b w:val="0"/>
         </w:rPr>
-        <w:t>第二次：“还紧张” compares this moment with the graduation examination.</w:t>
+        <w:t>第二次：注意“比……还紧张”。</w:t>
       </w:r>
     </w:p>
     <w:p>
@@ -4025,16 +5025,17 @@
         <w:rPr>
           <w:b w:val="0"/>
         </w:rPr>
-        <w:t>讲评：A full effect answer names what is shown and how strongly（对象＋程度）.</w:t>
-      </w:r>
-    </w:p>
-    <w:p>
-      <w:pPr>
-        <w:pStyle w:val="Heading2"/>
-        <w:snapToGrid w:val="0"/>
-      </w:pPr>
-      <w:r>
-        <w:t>保留的教参口头追问</w:t>
+        <w:t>讲评：回答表达作用（effect）时，要说清写出了什么、突出到什么程度。</w:t>
+      </w:r>
+    </w:p>
+    <w:p>
+      <w:pPr>
+        <w:pStyle w:val="Heading1"/>
+        <w:pageBreakBefore/>
+        <w:snapToGrid w:val="0"/>
+      </w:pPr>
+      <w:r>
+        <w:t>问题页13　歌声有什么含义</w:t>
       </w:r>
     </w:p>
     <w:p>
@@ -4045,7 +5046,40 @@
         <w:rPr>
           <w:b/>
         </w:rPr>
-        <w:t>可以删掉“张大眼睛”吗？为什么？</w:t>
+        <w:t>第3课　你做　来源：课本 阅读放大镜二；第16段旁注</w:t>
+      </w:r>
+    </w:p>
+    <w:p>
+      <w:pPr>
+        <w:snapToGrid w:val="0"/>
+      </w:pPr>
+      <w:r>
+        <w:rPr>
+          <w:rFonts w:ascii="LXGW WenKai TC" w:hAnsi="LXGW WenKai TC" w:eastAsia="LXGW WenKai TC"/>
+          <w:b w:val="0"/>
+        </w:rPr>
+        <w:t>阅读课文，了解课文内容：女儿对“我”表达爱——“我”的反应与感受；“我”对母亲表达爱——母亲的反应与感受。</w:t>
+      </w:r>
+    </w:p>
+    <w:p>
+      <w:pPr>
+        <w:snapToGrid w:val="0"/>
+      </w:pPr>
+      <w:r>
+        <w:rPr>
+          <w:rFonts w:ascii="LXGW WenKai TC" w:hAnsi="LXGW WenKai TC" w:eastAsia="LXGW WenKai TC"/>
+          <w:b w:val="0"/>
+        </w:rPr>
+        <w:t>最后一句话有什么含义？</w:t>
+      </w:r>
+    </w:p>
+    <w:p>
+      <w:pPr>
+        <w:pStyle w:val="Heading2"/>
+        <w:snapToGrid w:val="0"/>
+      </w:pPr>
+      <w:r>
+        <w:t>审题与取证</w:t>
       </w:r>
     </w:p>
     <w:p>
@@ -4056,7 +5090,188 @@
         <w:rPr>
           <w:b w:val="0"/>
         </w:rPr>
-        <w:t>不宜删掉。这个神态细节表现女儿看见新衣时的惊喜和欣赏，和真诚的赞美互相配合。</w:t>
+        <w:t>题干关键词：反应与感受、最后一句话、含义。</w:t>
+      </w:r>
+    </w:p>
+    <w:p>
+      <w:pPr>
+        <w:snapToGrid w:val="0"/>
+      </w:pPr>
+      <w:r>
+        <w:rPr>
+          <w:b w:val="0"/>
+        </w:rPr>
+        <w:t>母亲原来的状态：第9段；注意“抑郁”“沉默寡言”。</w:t>
+      </w:r>
+    </w:p>
+    <w:p>
+      <w:pPr>
+        <w:snapToGrid w:val="0"/>
+      </w:pPr>
+      <w:r>
+        <w:rPr>
+          <w:b w:val="0"/>
+        </w:rPr>
+        <w:t>表达爱之后的变化：第16段；注意“唱着歌”“第一次听到”。</w:t>
+      </w:r>
+    </w:p>
+    <w:p>
+      <w:pPr>
+        <w:snapToGrid w:val="0"/>
+      </w:pPr>
+      <w:r>
+        <w:rPr>
+          <w:b w:val="0"/>
+        </w:rPr>
+        <w:t>所需加工：定位并比较、辨析或整合信息；检查后说明为什么。</w:t>
+      </w:r>
+    </w:p>
+    <w:p>
+      <w:pPr>
+        <w:pStyle w:val="Heading2"/>
+        <w:snapToGrid w:val="0"/>
+      </w:pPr>
+      <w:r>
+        <w:t>参考答案</w:t>
+      </w:r>
+    </w:p>
+    <w:p>
+      <w:pPr>
+        <w:snapToGrid w:val="0"/>
+      </w:pPr>
+      <w:r>
+        <w:rPr>
+          <w:rFonts w:ascii="LXGW WenKai TC" w:hAnsi="LXGW WenKai TC" w:eastAsia="LXGW WenKai TC"/>
+          <w:b w:val="0"/>
+        </w:rPr>
+        <w:t>女儿对“我”表达爱，使“我”有成就感、心情愉快，觉得再辛苦也值得。“我”表达爱后，母亲一边做饭一边唱歌；结合先前的抑郁沉默，可推断她感受到女儿的爱与安慰，心情有所好转。结尾用歌声的变化突出爱的表达带来的力量，呼应题目。</w:t>
+      </w:r>
+    </w:p>
+    <w:p>
+      <w:pPr>
+        <w:pStyle w:val="Heading2"/>
+        <w:snapToGrid w:val="0"/>
+      </w:pPr>
+      <w:r>
+        <w:t>意义得分点与接受范围</w:t>
+      </w:r>
+    </w:p>
+    <w:p>
+      <w:pPr>
+        <w:snapToGrid w:val="0"/>
+      </w:pPr>
+      <w:r>
+        <w:rPr>
+          <w:b w:val="0"/>
+        </w:rPr>
+        <w:t>• 写母亲唱歌的行为（建议1分）</w:t>
+      </w:r>
+    </w:p>
+    <w:p>
+      <w:pPr>
+        <w:snapToGrid w:val="0"/>
+      </w:pPr>
+      <w:r>
+        <w:rPr>
+          <w:b w:val="0"/>
+        </w:rPr>
+        <w:t>• 联系前文抑郁沉默的状态（建议1分）</w:t>
+      </w:r>
+    </w:p>
+    <w:p>
+      <w:pPr>
+        <w:snapToGrid w:val="0"/>
+      </w:pPr>
+      <w:r>
+        <w:rPr>
+          <w:b w:val="0"/>
+        </w:rPr>
+        <w:t>• 推断感到爱与安慰、心情好转（建议1分）</w:t>
+      </w:r>
+    </w:p>
+    <w:p>
+      <w:pPr>
+        <w:snapToGrid w:val="0"/>
+      </w:pPr>
+      <w:r>
+        <w:rPr>
+          <w:b w:val="0"/>
+        </w:rPr>
+        <w:t>• 说明歌声表现爱的表达的作用（建议1分）</w:t>
+      </w:r>
+    </w:p>
+    <w:p>
+      <w:pPr>
+        <w:snapToGrid w:val="0"/>
+      </w:pPr>
+      <w:r>
+        <w:rPr>
+          <w:b w:val="0"/>
+        </w:rPr>
+        <w:t>以上分值为课堂讲评建议，并非教材公布的官方评分。按独立意义单位给分，接受等义表达。引用原文可作证据，但须筛选并回应题意；整段照抄不等于完成分析。</w:t>
+      </w:r>
+    </w:p>
+    <w:p>
+      <w:pPr>
+        <w:snapToGrid w:val="0"/>
+      </w:pPr>
+      <w:r>
+        <w:rPr>
+          <w:b w:val="0"/>
+        </w:rPr>
+        <w:t>不接受或需订正：不能推断她从此永不悲伤或完全摆脱丧亲之痛。</w:t>
+      </w:r>
+    </w:p>
+    <w:p>
+      <w:pPr>
+        <w:pStyle w:val="Heading2"/>
+        <w:snapToGrid w:val="0"/>
+      </w:pPr>
+      <w:r>
+        <w:t>分层提示与讲评</w:t>
+      </w:r>
+    </w:p>
+    <w:p>
+      <w:pPr>
+        <w:snapToGrid w:val="0"/>
+      </w:pPr>
+      <w:r>
+        <w:rPr>
+          <w:b w:val="0"/>
+        </w:rPr>
+        <w:t>第一次：留意心情的变化，不只看做饭的动作。</w:t>
+      </w:r>
+    </w:p>
+    <w:p>
+      <w:pPr>
+        <w:snapToGrid w:val="0"/>
+      </w:pPr>
+      <w:r>
+        <w:rPr>
+          <w:b w:val="0"/>
+        </w:rPr>
+        <w:t>第二次：第9段“沉默寡言”，第16段“唱着歌”“第一次”。</w:t>
+      </w:r>
+    </w:p>
+    <w:p>
+      <w:pPr>
+        <w:snapToGrid w:val="0"/>
+      </w:pPr>
+      <w:r>
+        <w:rPr>
+          <w:b w:val="0"/>
+        </w:rPr>
+        <w:t>讲评：唱歌是直接信息（Direct Info）；感受到爱与安慰，是联系前文作出的推断（Inference）。</w:t>
+      </w:r>
+    </w:p>
+    <w:p>
+      <w:pPr>
+        <w:pStyle w:val="Heading1"/>
+        <w:pageBreakBefore/>
+        <w:snapToGrid w:val="0"/>
+      </w:pPr>
+      <w:r>
+        <w:t>问题页14　全文：用证据比较人物</w:t>
       </w:r>
     </w:p>
     <w:p>
@@ -4067,39 +5282,7 @@
         <w:rPr>
           <w:b/>
         </w:rPr>
-        <w:t>“破天荒”是什么意思？在文中有什么含义？</w:t>
-      </w:r>
-    </w:p>
-    <w:p>
-      <w:pPr>
-        <w:snapToGrid w:val="0"/>
-      </w:pPr>
-      <w:r>
-        <w:rPr>
-          <w:b w:val="0"/>
-        </w:rPr>
-        <w:t>指以前从未有过。这里指“我”第一次直接向母亲说出感谢和爱。</w:t>
-      </w:r>
-    </w:p>
-    <w:p>
-      <w:pPr>
-        <w:pStyle w:val="Heading1"/>
-        <w:pageBreakBefore/>
-        <w:snapToGrid w:val="0"/>
-      </w:pPr>
-      <w:r>
-        <w:t>任务7　用证据比较人物</w:t>
-      </w:r>
-    </w:p>
-    <w:p>
-      <w:pPr>
-        <w:snapToGrid w:val="0"/>
-      </w:pPr>
-      <w:r>
-        <w:rPr>
-          <w:b/>
-        </w:rPr>
-        <w:t>第2课　你做　来源：课本 阅读放大镜三；第10段旁注后半问</w:t>
+        <w:t>第3课　你做　来源：课本 阅读放大镜三；第10段旁注后半问</w:t>
       </w:r>
     </w:p>
     <w:p>
@@ -4302,7 +5485,7 @@
         <w:rPr>
           <w:b w:val="0"/>
         </w:rPr>
-        <w:t>第一次：Compare how each person expresses feelings（表达方式）.</w:t>
+        <w:t>第一次：比较每个人表达感情的方式。</w:t>
       </w:r>
     </w:p>
     <w:p>
@@ -4313,7 +5496,7 @@
         <w:rPr>
           <w:b w:val="0"/>
         </w:rPr>
-        <w:t>第二次：Use words/actions for the son and daughter. Use thoughts and hesitation for “我”.</w:t>
+        <w:t>第二次：儿子和女儿看语言、行动；“我”还要看心理与犹豫。</w:t>
       </w:r>
     </w:p>
     <w:p>
@@ -4324,7 +5507,7 @@
         <w:rPr>
           <w:b w:val="0"/>
         </w:rPr>
-        <w:t>讲评：The textbook calls 双眼含笑、一脸欣赏 part of 外貌描写. Here these are facial expressions（神态）. Compare evidence, then infer a trait.</w:t>
+        <w:t>讲评：课本将“双眼含笑、一脸欣赏”列为外貌描写，更细可称神态描写（facial expression）。先比较证据，再概括特点。</w:t>
       </w:r>
     </w:p>
     <w:p>
@@ -4345,456 +5528,7 @@
         <w:snapToGrid w:val="0"/>
       </w:pPr>
       <w:r>
-        <w:t>任务8　歌声有什么含义</w:t>
-      </w:r>
-    </w:p>
-    <w:p>
-      <w:pPr>
-        <w:snapToGrid w:val="0"/>
-      </w:pPr>
-      <w:r>
-        <w:rPr>
-          <w:b/>
-        </w:rPr>
-        <w:t>第3课　你做　来源：课本 阅读放大镜二；第16段旁注</w:t>
-      </w:r>
-    </w:p>
-    <w:p>
-      <w:pPr>
-        <w:snapToGrid w:val="0"/>
-      </w:pPr>
-      <w:r>
-        <w:rPr>
-          <w:rFonts w:ascii="LXGW WenKai TC" w:hAnsi="LXGW WenKai TC" w:eastAsia="LXGW WenKai TC"/>
-          <w:b w:val="0"/>
-        </w:rPr>
-        <w:t>阅读课文，了解课文内容：女儿对“我”表达爱——“我”的反应与感受；“我”对母亲表达爱——母亲的反应与感受。</w:t>
-      </w:r>
-    </w:p>
-    <w:p>
-      <w:pPr>
-        <w:snapToGrid w:val="0"/>
-      </w:pPr>
-      <w:r>
-        <w:rPr>
-          <w:rFonts w:ascii="LXGW WenKai TC" w:hAnsi="LXGW WenKai TC" w:eastAsia="LXGW WenKai TC"/>
-          <w:b w:val="0"/>
-        </w:rPr>
-        <w:t>最后一句话有什么含义？</w:t>
-      </w:r>
-    </w:p>
-    <w:p>
-      <w:pPr>
-        <w:pStyle w:val="Heading2"/>
-        <w:snapToGrid w:val="0"/>
-      </w:pPr>
-      <w:r>
-        <w:t>审题与取证</w:t>
-      </w:r>
-    </w:p>
-    <w:p>
-      <w:pPr>
-        <w:snapToGrid w:val="0"/>
-      </w:pPr>
-      <w:r>
-        <w:rPr>
-          <w:b w:val="0"/>
-        </w:rPr>
-        <w:t>题干关键词：反应与感受、最后一句话、含义。</w:t>
-      </w:r>
-    </w:p>
-    <w:p>
-      <w:pPr>
-        <w:snapToGrid w:val="0"/>
-      </w:pPr>
-      <w:r>
-        <w:rPr>
-          <w:b w:val="0"/>
-        </w:rPr>
-        <w:t>母亲原来的状态：第9段；注意“抑郁”“沉默寡言”。</w:t>
-      </w:r>
-    </w:p>
-    <w:p>
-      <w:pPr>
-        <w:snapToGrid w:val="0"/>
-      </w:pPr>
-      <w:r>
-        <w:rPr>
-          <w:b w:val="0"/>
-        </w:rPr>
-        <w:t>表达爱之后的变化：第16段；注意“唱着歌”“第一次听到”。</w:t>
-      </w:r>
-    </w:p>
-    <w:p>
-      <w:pPr>
-        <w:snapToGrid w:val="0"/>
-      </w:pPr>
-      <w:r>
-        <w:rPr>
-          <w:b w:val="0"/>
-        </w:rPr>
-        <w:t>所需加工：定位并比较、辨析或整合信息；检查后说明为什么。</w:t>
-      </w:r>
-    </w:p>
-    <w:p>
-      <w:pPr>
-        <w:pStyle w:val="Heading2"/>
-        <w:snapToGrid w:val="0"/>
-      </w:pPr>
-      <w:r>
-        <w:t>参考答案</w:t>
-      </w:r>
-    </w:p>
-    <w:p>
-      <w:pPr>
-        <w:snapToGrid w:val="0"/>
-      </w:pPr>
-      <w:r>
-        <w:rPr>
-          <w:rFonts w:ascii="LXGW WenKai TC" w:hAnsi="LXGW WenKai TC" w:eastAsia="LXGW WenKai TC"/>
-          <w:b w:val="0"/>
-        </w:rPr>
-        <w:t>女儿对“我”表达爱，使“我”有成就感、心情愉快，觉得再辛苦也值得。“我”表达爱后，母亲一边做饭一边唱歌；结合先前的抑郁沉默，可推断她感受到女儿的爱与安慰，心情有所好转。结尾用歌声的变化突出爱的表达带来的力量，呼应题目。</w:t>
-      </w:r>
-    </w:p>
-    <w:p>
-      <w:pPr>
-        <w:pStyle w:val="Heading2"/>
-        <w:snapToGrid w:val="0"/>
-      </w:pPr>
-      <w:r>
-        <w:t>意义得分点与接受范围</w:t>
-      </w:r>
-    </w:p>
-    <w:p>
-      <w:pPr>
-        <w:snapToGrid w:val="0"/>
-      </w:pPr>
-      <w:r>
-        <w:rPr>
-          <w:b w:val="0"/>
-        </w:rPr>
-        <w:t>• 写母亲唱歌的行为（建议1分）</w:t>
-      </w:r>
-    </w:p>
-    <w:p>
-      <w:pPr>
-        <w:snapToGrid w:val="0"/>
-      </w:pPr>
-      <w:r>
-        <w:rPr>
-          <w:b w:val="0"/>
-        </w:rPr>
-        <w:t>• 联系前文抑郁沉默的状态（建议1分）</w:t>
-      </w:r>
-    </w:p>
-    <w:p>
-      <w:pPr>
-        <w:snapToGrid w:val="0"/>
-      </w:pPr>
-      <w:r>
-        <w:rPr>
-          <w:b w:val="0"/>
-        </w:rPr>
-        <w:t>• 推断感到爱与安慰、心情好转（建议1分）</w:t>
-      </w:r>
-    </w:p>
-    <w:p>
-      <w:pPr>
-        <w:snapToGrid w:val="0"/>
-      </w:pPr>
-      <w:r>
-        <w:rPr>
-          <w:b w:val="0"/>
-        </w:rPr>
-        <w:t>• 说明歌声表现爱的表达的作用（建议1分）</w:t>
-      </w:r>
-    </w:p>
-    <w:p>
-      <w:pPr>
-        <w:snapToGrid w:val="0"/>
-      </w:pPr>
-      <w:r>
-        <w:rPr>
-          <w:b w:val="0"/>
-        </w:rPr>
-        <w:t>以上分值为课堂讲评建议，并非教材公布的官方评分。按独立意义单位给分，接受等义表达。引用原文可作证据，但须筛选并回应题意；整段照抄不等于完成分析。</w:t>
-      </w:r>
-    </w:p>
-    <w:p>
-      <w:pPr>
-        <w:snapToGrid w:val="0"/>
-      </w:pPr>
-      <w:r>
-        <w:rPr>
-          <w:b w:val="0"/>
-        </w:rPr>
-        <w:t>不接受或需订正：不能推断她从此永不悲伤或完全摆脱丧亲之痛。</w:t>
-      </w:r>
-    </w:p>
-    <w:p>
-      <w:pPr>
-        <w:pStyle w:val="Heading2"/>
-        <w:snapToGrid w:val="0"/>
-      </w:pPr>
-      <w:r>
-        <w:t>分层提示与讲评</w:t>
-      </w:r>
-    </w:p>
-    <w:p>
-      <w:pPr>
-        <w:snapToGrid w:val="0"/>
-      </w:pPr>
-      <w:r>
-        <w:rPr>
-          <w:b w:val="0"/>
-        </w:rPr>
-        <w:t>第一次：Look at the change, not just the act of cooking.</w:t>
-      </w:r>
-    </w:p>
-    <w:p>
-      <w:pPr>
-        <w:snapToGrid w:val="0"/>
-      </w:pPr>
-      <w:r>
-        <w:rPr>
-          <w:b w:val="0"/>
-        </w:rPr>
-        <w:t>第二次：第9段“沉默寡言”；第16段“唱着歌”“第一次”。</w:t>
-      </w:r>
-    </w:p>
-    <w:p>
-      <w:pPr>
-        <w:snapToGrid w:val="0"/>
-      </w:pPr>
-      <w:r>
-        <w:rPr>
-          <w:b w:val="0"/>
-        </w:rPr>
-        <w:t>讲评：Singing is Direct Info. Feeling comforted is a supported Inference（有依据的推断）.</w:t>
-      </w:r>
-    </w:p>
-    <w:p>
-      <w:pPr>
-        <w:pStyle w:val="Heading1"/>
-        <w:pageBreakBefore/>
-        <w:snapToGrid w:val="0"/>
-      </w:pPr>
-      <w:r>
-        <w:t>任务9　第一次一定最难吗</w:t>
-      </w:r>
-    </w:p>
-    <w:p>
-      <w:pPr>
-        <w:snapToGrid w:val="0"/>
-      </w:pPr>
-      <w:r>
-        <w:rPr>
-          <w:b/>
-        </w:rPr>
-        <w:t>第3课　我们做　来源：课本旁注 第12段</w:t>
-      </w:r>
-    </w:p>
-    <w:p>
-      <w:pPr>
-        <w:snapToGrid w:val="0"/>
-      </w:pPr>
-      <w:r>
-        <w:rPr>
-          <w:rFonts w:ascii="LXGW WenKai TC" w:hAnsi="LXGW WenKai TC" w:eastAsia="LXGW WenKai TC"/>
-          <w:b w:val="0"/>
-        </w:rPr>
-        <w:t>“我”认为第一次对母亲说出爱总是最难的。你同意吗？为什么？</w:t>
-      </w:r>
-    </w:p>
-    <w:p>
-      <w:pPr>
-        <w:pStyle w:val="Heading2"/>
-        <w:snapToGrid w:val="0"/>
-      </w:pPr>
-      <w:r>
-        <w:t>审题与取证</w:t>
-      </w:r>
-    </w:p>
-    <w:p>
-      <w:pPr>
-        <w:snapToGrid w:val="0"/>
-      </w:pPr>
-      <w:r>
-        <w:rPr>
-          <w:b w:val="0"/>
-        </w:rPr>
-        <w:t>题干关键词：你同意吗、为什么。</w:t>
-      </w:r>
-    </w:p>
-    <w:p>
-      <w:pPr>
-        <w:snapToGrid w:val="0"/>
-      </w:pPr>
-      <w:r>
-        <w:rPr>
-          <w:b w:val="0"/>
-        </w:rPr>
-        <w:t>定位范围：第11至15段。</w:t>
-      </w:r>
-    </w:p>
-    <w:p>
-      <w:pPr>
-        <w:snapToGrid w:val="0"/>
-      </w:pPr>
-      <w:r>
-        <w:rPr>
-          <w:b w:val="0"/>
-        </w:rPr>
-        <w:t>所需加工：明确立场，解释适用条件，用课文支持判断。</w:t>
-      </w:r>
-    </w:p>
-    <w:p>
-      <w:pPr>
-        <w:pStyle w:val="Heading2"/>
-        <w:snapToGrid w:val="0"/>
-      </w:pPr>
-      <w:r>
-        <w:t>参考答案</w:t>
-      </w:r>
-    </w:p>
-    <w:p>
-      <w:pPr>
-        <w:snapToGrid w:val="0"/>
-      </w:pPr>
-      <w:r>
-        <w:rPr>
-          <w:rFonts w:ascii="LXGW WenKai TC" w:hAnsi="LXGW WenKai TC" w:eastAsia="LXGW WenKai TC"/>
-          <w:b w:val="0"/>
-        </w:rPr>
-        <w:t>可以部分同意。对一向把感情藏在心里的人，第一次开口要克服害羞和不习惯，像文中的“我”；但对平时就常表达感情的人，例如女儿，开口可能较自然。因此，难不难与个人习惯和关系情境有关。</w:t>
-      </w:r>
-    </w:p>
-    <w:p>
-      <w:pPr>
-        <w:pStyle w:val="Heading2"/>
-        <w:snapToGrid w:val="0"/>
-      </w:pPr>
-      <w:r>
-        <w:t>意义得分点与接受范围</w:t>
-      </w:r>
-    </w:p>
-    <w:p>
-      <w:pPr>
-        <w:snapToGrid w:val="0"/>
-      </w:pPr>
-      <w:r>
-        <w:rPr>
-          <w:b w:val="0"/>
-        </w:rPr>
-        <w:t>• 表明立场（建议1分）</w:t>
-      </w:r>
-    </w:p>
-    <w:p>
-      <w:pPr>
-        <w:snapToGrid w:val="0"/>
-      </w:pPr>
-      <w:r>
-        <w:rPr>
-          <w:b w:val="0"/>
-        </w:rPr>
-        <w:t>• 解释适用的人或条件（建议1分）</w:t>
-      </w:r>
-    </w:p>
-    <w:p>
-      <w:pPr>
-        <w:snapToGrid w:val="0"/>
-      </w:pPr>
-      <w:r>
-        <w:rPr>
-          <w:b w:val="0"/>
-        </w:rPr>
-        <w:t>• 用课文例子支持理由（建议1分）</w:t>
-      </w:r>
-    </w:p>
-    <w:p>
-      <w:pPr>
-        <w:snapToGrid w:val="0"/>
-      </w:pPr>
-      <w:r>
-        <w:rPr>
-          <w:b w:val="0"/>
-        </w:rPr>
-        <w:t>以上分值为课堂讲评建议，并非教材公布的官方评分。按独立意义单位给分，接受等义表达。引用原文可作证据，但须筛选并回应题意；整段照抄不等于完成分析。</w:t>
-      </w:r>
-    </w:p>
-    <w:p>
-      <w:pPr>
-        <w:snapToGrid w:val="0"/>
-      </w:pPr>
-      <w:r>
-        <w:rPr>
-          <w:b w:val="0"/>
-        </w:rPr>
-        <w:t>不接受或需订正：只写“同意，因为第一次最难”是循环解释。</w:t>
-      </w:r>
-    </w:p>
-    <w:p>
-      <w:pPr>
-        <w:pStyle w:val="Heading2"/>
-        <w:snapToGrid w:val="0"/>
-      </w:pPr>
-      <w:r>
-        <w:t>分层提示与讲评</w:t>
-      </w:r>
-    </w:p>
-    <w:p>
-      <w:pPr>
-        <w:snapToGrid w:val="0"/>
-      </w:pPr>
-      <w:r>
-        <w:rPr>
-          <w:b w:val="0"/>
-        </w:rPr>
-        <w:t>第一次：Does the difficulty depend on a person’s habits?</w:t>
-      </w:r>
-    </w:p>
-    <w:p>
-      <w:pPr>
-        <w:snapToGrid w:val="0"/>
-      </w:pPr>
-      <w:r>
-        <w:rPr>
-          <w:b w:val="0"/>
-        </w:rPr>
-        <w:t>第二次：Compare “我” with the daughter. Is this true for everyone?</w:t>
-      </w:r>
-    </w:p>
-    <w:p>
-      <w:pPr>
-        <w:snapToGrid w:val="0"/>
-      </w:pPr>
-      <w:r>
-        <w:rPr>
-          <w:b w:val="0"/>
-        </w:rPr>
-        <w:t>讲评：A supported alternative view is valid（有理即可）. An opinion is not a universal fact.</w:t>
-      </w:r>
-    </w:p>
-    <w:p>
-      <w:pPr>
-        <w:snapToGrid w:val="0"/>
-      </w:pPr>
-      <w:r>
-        <w:rPr>
-          <w:b w:val="0"/>
-        </w:rPr>
-        <w:t>先保留首次回答，比较得分意义后在订正框补足。网页不按字数或关键词给主观题评分；教师覆核观点、证据及关系。</w:t>
-      </w:r>
-    </w:p>
-    <w:p>
-      <w:pPr>
-        <w:pStyle w:val="Heading1"/>
-        <w:pageBreakBefore/>
-        <w:snapToGrid w:val="0"/>
-      </w:pPr>
-      <w:r>
-        <w:t>任务10　爱需不需要说出来</w:t>
+        <w:t>问题页15　全文：爱需不需要说出来</w:t>
       </w:r>
     </w:p>
     <w:p>
@@ -4848,7 +5582,7 @@
         <w:rPr>
           <w:b w:val="0"/>
         </w:rPr>
-        <w:t>定位范围：第1至16段。</w:t>
+        <w:t>定位范围：第1、16段。</w:t>
       </w:r>
     </w:p>
     <w:p>
@@ -4997,7 +5731,7 @@
         <w:rPr>
           <w:b w:val="0"/>
         </w:rPr>
-        <w:t>第一次：Explain why your chosen way of showing love helps.</w:t>
+        <w:t>第一次：解释为什么这种表达方式有帮助。</w:t>
       </w:r>
     </w:p>
     <w:p>
@@ -5008,7 +5742,7 @@
         <w:rPr>
           <w:b w:val="0"/>
         </w:rPr>
-        <w:t>第二次：Use the listener’s needs, possible misunderstandings or the value of actions.</w:t>
+        <w:t>第二次：可从家人的需要、可能的误会或行动的作用来解释。</w:t>
       </w:r>
     </w:p>
     <w:p>
@@ -5019,7 +5753,7 @@
         <w:rPr>
           <w:b w:val="0"/>
         </w:rPr>
-        <w:t>讲评：Different views can earn credit. The reason and example must support the same view（理由、例子与立场一致）. Teacher review, not automatic grading.</w:t>
+        <w:t>讲评：不同立场都可以成立。理由、例子须支持同一个看法，由教师核对。</w:t>
       </w:r>
     </w:p>
     <w:p>
@@ -5060,7 +5794,7 @@
         <w:rPr>
           <w:b w:val="0"/>
         </w:rPr>
-        <w:t>第一课：导入3分钟；第1–8段图文与任务1–3共29分钟；第9–11段及任务4共13分钟；订正5分钟。保留任务3简答，缩短重复汇报。</w:t>
+        <w:t>第一课：导入3分钟；按段落顺序完成第1–8段图文与问题29分钟；第9–11段及随段问题13分钟；订正5分钟。保留第4段看法和第10段特点短答，缩短重复汇报。</w:t>
       </w:r>
     </w:p>
     <w:p>
@@ -5071,7 +5805,7 @@
         <w:rPr>
           <w:b w:val="0"/>
         </w:rPr>
-        <w:t>第二课：第12–16段阅读10分钟；任务5口头共构5分钟；任务6点选比较6分钟；任务7独立人物回答10分钟；任务8整合5分钟；任务9口头讨论4分钟；任务10独立回应7分钟；订正3分钟。合计50分钟。</w:t>
+        <w:t>第二课：第12段阅读、口头讨论与惯用语10分钟；第13–14段阅读、词义及原因口头共构10分钟；第15段比较作用4分钟；第16段与结尾6分钟；全文人物比较10分钟；开放回应7分钟；订正3分钟。合计50分钟。</w:t>
       </w:r>
     </w:p>
     <w:p>
@@ -5082,7 +5816,7 @@
         <w:rPr>
           <w:b w:val="0"/>
         </w:rPr>
-        <w:t>两课时版的任务5、9通过投影口头完成，学生页可继续访问但不以提交这些题作为完成全课的门槛。教师不把两题的共构答案当作独立掌握。人物比较和最后开放回应仍须独立作答。程度较弱、需要逐题书写的班级优先用三课时版。</w:t>
+        <w:t>两课时版的第12段讨论和第14段原因题通过投影口头完成，学生页可继续访问但不以提交这些题作为完成全课的门槛。教师不把两题的共构答案当作独立掌握。人物比较和最后开放回应仍须独立作答。程度较弱、需要逐题书写的班级优先用三课时版。</w:t>
       </w:r>
     </w:p>
     <w:p>
@@ -5124,7 +5858,7 @@
         <w:rPr>
           <w:b w:val="0"/>
         </w:rPr>
-        <w:t>• 课件问题与讲解分开页；先让学生答，再翻到答案页。在线投影与45页可编辑PPT对应，课堂可随时跳页。</w:t>
+        <w:t>• 课件问题与讲解分开页；先让学生答，再翻到答案页。在线投影与50页可编辑PPT对应，课堂可随时跳页。</w:t>
       </w:r>
     </w:p>
     <w:p>
@@ -5135,7 +5869,7 @@
         <w:rPr>
           <w:b w:val="0"/>
         </w:rPr>
-        <w:t>• 读文时左原文、右中文段号和对应漫画，下面收藏词语；任务中先点原句，再点证据框，iPad不必依赖拖放。</w:t>
+        <w:t>• 读文时左原文、右中文段号和对应漫画，下面收藏词语；问题页左边显示相应段落、右边显示该段问题。点原句后按“加入原句”，可连续累加多句，也可直接粘贴、编辑，iPad不必依赖拖放。</w:t>
       </w:r>
     </w:p>
     <w:p>
@@ -5177,7 +5911,7 @@
         <w:rPr>
           <w:b w:val="0"/>
         </w:rPr>
-        <w:t>个人词语本沿用huawentong-personal-words-v1和huawentong-words-v1格式；有本课／全部筛选、编辑、导入导出与翻卡。未收录词可建卡，释义标为待补；未有释义不能标已记住。同词保留已有解释与熟悉状态，另列本课语境义。重置本课不删词语本。</w:t>
+        <w:t>个人词语本沿用huawentong-personal-words-v1和huawentong-words-v1格式；按年级、单元和课文筛选，保留同词的各课文出处，支持编辑、导入导出与翻卡。未收录词可建卡，释义标为待补；未有释义不能标已记住。同词保留已有解释与熟悉状态，另列本课语境义。重置本课不删词语本。本次顺序调整保留旧版回答于完整备份；拆开的题目重新作答，不把旧答案套入新题。</w:t>
       </w:r>
     </w:p>
     <w:p>

</xml_diff>